<commit_message>
docs: harden China quarterly sampling plan
</commit_message>
<xml_diff>
--- a/docs/plans/word/中国版AlphaEarth全国采样方案_2020_2021季度版_20260726.docx
+++ b/docs/plans/word/中国版AlphaEarth全国采样方案_2020_2021季度版_20260726.docx
@@ -13,7 +13,7 @@
           <w:b/>
           <w:sz w:val="32"/>
         </w:rPr>
-        <w:t>中国版 Alpha Earth 全国采样方案</w:t>
+        <w:t>中国版 Alpha Earth 全国目标采样方案</w:t>
       </w:r>
     </w:p>
     <w:p>
@@ -33,7 +33,7 @@
           <w:rFonts w:ascii="Times New Roman" w:hAnsi="Times New Roman" w:cs="Times New Roman" w:eastAsia="宋体"/>
           <w:sz w:val="24"/>
         </w:rPr>
-        <w:t xml:space="preserve"> 2020 年和 2021 年八期季度嵌入共用一套 </w:t>
+        <w:t xml:space="preserve"> 2020 年和 2021 年八期季度嵌入拟共用一套 </w:t>
       </w:r>
       <w:r>
         <w:rPr>
@@ -48,7 +48,7 @@
           <w:rFonts w:ascii="Times New Roman" w:hAnsi="Times New Roman" w:cs="Times New Roman" w:eastAsia="宋体"/>
           <w:sz w:val="24"/>
         </w:rPr>
-        <w:t xml:space="preserve"> 空间 patch 的训练骨架。样本由 57,405 个全国基础 1% 样本、2,595 个空间 均衡样本、500 个海岸样本和 1,500 个城市/稀有地物/困难区域样本组成。 每个 patch 为 1,280 m × 1,280 m，模型输出为 128 × 128 × 64。</w:t>
+        <w:t xml:space="preserve"> 空间影像块的训练骨架。目标配额由 57,405 个全国基础候选、2,595 个空间 均衡候选、500 个海岸候选和 1,500 个城市/稀有地物/困难区域候选组成。 每个 patch 为 1,280 m × 1,280 m，模型输出为 128 × 128 × 64。</w:t>
       </w:r>
     </w:p>
     <w:p>
@@ -58,6 +58,592 @@
           <w:sz w:val="24"/>
         </w:rPr>
         <w:t>版本：2026-07-26 适用产品：2020Q1--2021Q4 全国季度 10 米、64 维地理嵌入 参考文件：《中国版 Alpha Earth：国家级地球嵌入建设方案（现有资源）》</w:t>
+      </w:r>
+    </w:p>
+    <w:p>
+      <w:r>
+        <w:rPr>
+          <w:rFonts w:ascii="Times New Roman" w:hAnsi="Times New Roman" w:cs="Times New Roman" w:eastAsia="宋体"/>
+          <w:sz w:val="24"/>
+        </w:rPr>
+        <w:t>参考文件中的全国采样数量、实施状态和“训练期间定期运行固定下游测试”的条款 均由本文件替代，不再作为完成状态或评测协议依据。</w:t>
+      </w:r>
+    </w:p>
+    <w:p>
+      <w:r>
+        <w:rPr>
+          <w:rFonts w:ascii="Times New Roman" w:hAnsi="Times New Roman" w:cs="Times New Roman" w:eastAsia="宋体"/>
+          <w:sz w:val="24"/>
+        </w:rPr>
+        <w:t>本文件只规范 62,000 点训练采样注册表，不覆盖约 586 万全域推理网格、全国 嵌入导出、量化、接缝处理和发布质量检查。</w:t>
+      </w:r>
+    </w:p>
+    <w:p>
+      <w:pPr>
+        <w:pStyle w:val="Heading2"/>
+        <w:jc w:val="left"/>
+      </w:pPr>
+      <w:r>
+        <w:rPr>
+          <w:rFonts w:ascii="Times New Roman" w:hAnsi="Times New Roman" w:cs="Times New Roman" w:eastAsia="宋体"/>
+          <w:b/>
+          <w:sz w:val="24"/>
+        </w:rPr>
+        <w:t>当前完成状态</w:t>
+      </w:r>
+    </w:p>
+    <w:tbl>
+      <w:tblPr>
+        <w:tblStyle w:val="TableGrid"/>
+        <w:tblW w:type="auto" w:w="0"/>
+        <w:jc w:val="center"/>
+        <w:tblLayout w:type="autofit"/>
+        <w:tblLook w:firstColumn="1" w:firstRow="1" w:lastColumn="0" w:lastRow="0" w:noHBand="0" w:noVBand="1" w:val="04A0"/>
+      </w:tblPr>
+      <w:tblGrid>
+        <w:gridCol w:w="3024"/>
+        <w:gridCol w:w="3024"/>
+        <w:gridCol w:w="3024"/>
+      </w:tblGrid>
+      <w:tr>
+        <w:trPr>
+          <w:cantSplit/>
+          <w:tblHeader w:val="true"/>
+        </w:trPr>
+        <w:tc>
+          <w:tcPr>
+            <w:tcW w:type="dxa" w:w="3024"/>
+            <w:vAlign w:val="center"/>
+            <w:tcMar>
+              <w:top w:w="80" w:type="dxa"/>
+              <w:start w:w="80" w:type="dxa"/>
+              <w:bottom w:w="80" w:type="dxa"/>
+              <w:end w:w="80" w:type="dxa"/>
+            </w:tcMar>
+            <w:shd w:fill="E7E6E3"/>
+          </w:tcPr>
+          <w:p>
+            <w:pPr>
+              <w:jc w:val="center"/>
+            </w:pPr>
+            <w:r>
+              <w:rPr>
+                <w:b/>
+              </w:rPr>
+            </w:r>
+            <w:r>
+              <w:rPr>
+                <w:rFonts w:ascii="Times New Roman" w:hAnsi="Times New Roman" w:cs="Times New Roman" w:eastAsia="宋体"/>
+                <w:b/>
+                <w:sz w:val="21"/>
+              </w:rPr>
+              <w:t>项目</w:t>
+            </w:r>
+          </w:p>
+        </w:tc>
+        <w:tc>
+          <w:tcPr>
+            <w:tcW w:type="dxa" w:w="3024"/>
+            <w:vAlign w:val="center"/>
+            <w:tcMar>
+              <w:top w:w="80" w:type="dxa"/>
+              <w:start w:w="80" w:type="dxa"/>
+              <w:bottom w:w="80" w:type="dxa"/>
+              <w:end w:w="80" w:type="dxa"/>
+            </w:tcMar>
+            <w:shd w:fill="E7E6E3"/>
+          </w:tcPr>
+          <w:p>
+            <w:pPr>
+              <w:jc w:val="center"/>
+            </w:pPr>
+            <w:r>
+              <w:rPr>
+                <w:b/>
+              </w:rPr>
+            </w:r>
+            <w:r>
+              <w:rPr>
+                <w:rFonts w:ascii="Times New Roman" w:hAnsi="Times New Roman" w:cs="Times New Roman" w:eastAsia="宋体"/>
+                <w:b/>
+                <w:sz w:val="21"/>
+              </w:rPr>
+              <w:t>当前状态</w:t>
+            </w:r>
+          </w:p>
+        </w:tc>
+        <w:tc>
+          <w:tcPr>
+            <w:tcW w:type="dxa" w:w="3024"/>
+            <w:vAlign w:val="center"/>
+            <w:tcMar>
+              <w:top w:w="80" w:type="dxa"/>
+              <w:start w:w="80" w:type="dxa"/>
+              <w:bottom w:w="80" w:type="dxa"/>
+              <w:end w:w="80" w:type="dxa"/>
+            </w:tcMar>
+            <w:shd w:fill="E7E6E3"/>
+          </w:tcPr>
+          <w:p>
+            <w:pPr>
+              <w:jc w:val="center"/>
+            </w:pPr>
+            <w:r>
+              <w:rPr>
+                <w:b/>
+              </w:rPr>
+            </w:r>
+            <w:r>
+              <w:rPr>
+                <w:rFonts w:ascii="Times New Roman" w:hAnsi="Times New Roman" w:cs="Times New Roman" w:eastAsia="宋体"/>
+                <w:b/>
+                <w:sz w:val="21"/>
+              </w:rPr>
+              <w:t>是否可用于正式训练</w:t>
+            </w:r>
+          </w:p>
+        </w:tc>
+      </w:tr>
+      <w:tr>
+        <w:trPr>
+          <w:cantSplit/>
+        </w:trPr>
+        <w:tc>
+          <w:tcPr>
+            <w:tcW w:type="dxa" w:w="3024"/>
+            <w:vAlign w:val="center"/>
+            <w:tcMar>
+              <w:top w:w="80" w:type="dxa"/>
+              <w:start w:w="80" w:type="dxa"/>
+              <w:bottom w:w="80" w:type="dxa"/>
+              <w:end w:w="80" w:type="dxa"/>
+            </w:tcMar>
+          </w:tcPr>
+          <w:p>
+            <w:pPr>
+              <w:jc w:val="center"/>
+            </w:pPr>
+            <w:r/>
+            <w:r>
+              <w:rPr>
+                <w:rFonts w:ascii="Times New Roman" w:hAnsi="Times New Roman" w:cs="Times New Roman" w:eastAsia="宋体"/>
+                <w:sz w:val="21"/>
+              </w:rPr>
+              <w:t>57,405 个基础点</w:t>
+            </w:r>
+          </w:p>
+        </w:tc>
+        <w:tc>
+          <w:tcPr>
+            <w:tcW w:type="dxa" w:w="3024"/>
+            <w:vAlign w:val="center"/>
+            <w:tcMar>
+              <w:top w:w="80" w:type="dxa"/>
+              <w:start w:w="80" w:type="dxa"/>
+              <w:bottom w:w="80" w:type="dxa"/>
+              <w:end w:w="80" w:type="dxa"/>
+            </w:tcMar>
+          </w:tcPr>
+          <w:p>
+            <w:pPr>
+              <w:jc w:val="center"/>
+            </w:pPr>
+            <w:r/>
+            <w:r>
+              <w:rPr>
+                <w:rFonts w:ascii="Times New Roman" w:hAnsi="Times New Roman" w:cs="Times New Roman" w:eastAsia="宋体"/>
+                <w:sz w:val="21"/>
+              </w:rPr>
+              <w:t>已生成中心点静态候选，种子为 20260717</w:t>
+            </w:r>
+          </w:p>
+        </w:tc>
+        <w:tc>
+          <w:tcPr>
+            <w:tcW w:type="dxa" w:w="3024"/>
+            <w:vAlign w:val="center"/>
+            <w:tcMar>
+              <w:top w:w="80" w:type="dxa"/>
+              <w:start w:w="80" w:type="dxa"/>
+              <w:bottom w:w="80" w:type="dxa"/>
+              <w:end w:w="80" w:type="dxa"/>
+            </w:tcMar>
+          </w:tcPr>
+          <w:p>
+            <w:pPr>
+              <w:jc w:val="center"/>
+            </w:pPr>
+            <w:r/>
+            <w:r>
+              <w:rPr>
+                <w:rFonts w:ascii="Times New Roman" w:hAnsi="Times New Roman" w:cs="Times New Roman" w:eastAsia="宋体"/>
+                <w:sz w:val="21"/>
+              </w:rPr>
+              <w:t>否，尚未完成 footprint、跨 UTM 重叠和季度质量验收</w:t>
+            </w:r>
+          </w:p>
+        </w:tc>
+      </w:tr>
+      <w:tr>
+        <w:trPr>
+          <w:cantSplit/>
+        </w:trPr>
+        <w:tc>
+          <w:tcPr>
+            <w:tcW w:type="dxa" w:w="3024"/>
+            <w:vAlign w:val="center"/>
+            <w:tcMar>
+              <w:top w:w="80" w:type="dxa"/>
+              <w:start w:w="80" w:type="dxa"/>
+              <w:bottom w:w="80" w:type="dxa"/>
+              <w:end w:w="80" w:type="dxa"/>
+            </w:tcMar>
+          </w:tcPr>
+          <w:p>
+            <w:pPr>
+              <w:jc w:val="center"/>
+            </w:pPr>
+            <w:r/>
+            <w:r>
+              <w:rPr>
+                <w:rFonts w:ascii="Times New Roman" w:hAnsi="Times New Roman" w:cs="Times New Roman" w:eastAsia="宋体"/>
+                <w:sz w:val="21"/>
+              </w:rPr>
+              <w:t>60,500 个临时候选</w:t>
+            </w:r>
+          </w:p>
+        </w:tc>
+        <w:tc>
+          <w:tcPr>
+            <w:tcW w:type="dxa" w:w="3024"/>
+            <w:vAlign w:val="center"/>
+            <w:tcMar>
+              <w:top w:w="80" w:type="dxa"/>
+              <w:start w:w="80" w:type="dxa"/>
+              <w:bottom w:w="80" w:type="dxa"/>
+              <w:end w:w="80" w:type="dxa"/>
+            </w:tcMar>
+          </w:tcPr>
+          <w:p>
+            <w:pPr>
+              <w:jc w:val="center"/>
+            </w:pPr>
+            <w:r/>
+            <w:r>
+              <w:rPr>
+                <w:rFonts w:ascii="Times New Roman" w:hAnsi="Times New Roman" w:cs="Times New Roman" w:eastAsia="宋体"/>
+                <w:sz w:val="21"/>
+              </w:rPr>
+              <w:t>已有历史版本，但存在补样宏网格重复和字段不完整</w:t>
+            </w:r>
+          </w:p>
+        </w:tc>
+        <w:tc>
+          <w:tcPr>
+            <w:tcW w:type="dxa" w:w="3024"/>
+            <w:vAlign w:val="center"/>
+            <w:tcMar>
+              <w:top w:w="80" w:type="dxa"/>
+              <w:start w:w="80" w:type="dxa"/>
+              <w:bottom w:w="80" w:type="dxa"/>
+              <w:end w:w="80" w:type="dxa"/>
+            </w:tcMar>
+          </w:tcPr>
+          <w:p>
+            <w:pPr>
+              <w:jc w:val="center"/>
+            </w:pPr>
+            <w:r/>
+            <w:r>
+              <w:rPr>
+                <w:rFonts w:ascii="Times New Roman" w:hAnsi="Times New Roman" w:cs="Times New Roman" w:eastAsia="宋体"/>
+                <w:sz w:val="21"/>
+              </w:rPr>
+              <w:t>否，必须按本方案重建</w:t>
+            </w:r>
+          </w:p>
+        </w:tc>
+      </w:tr>
+      <w:tr>
+        <w:trPr>
+          <w:cantSplit/>
+        </w:trPr>
+        <w:tc>
+          <w:tcPr>
+            <w:tcW w:type="dxa" w:w="3024"/>
+            <w:vAlign w:val="center"/>
+            <w:tcMar>
+              <w:top w:w="80" w:type="dxa"/>
+              <w:start w:w="80" w:type="dxa"/>
+              <w:bottom w:w="80" w:type="dxa"/>
+              <w:end w:w="80" w:type="dxa"/>
+            </w:tcMar>
+          </w:tcPr>
+          <w:p>
+            <w:pPr>
+              <w:jc w:val="center"/>
+            </w:pPr>
+            <w:r/>
+            <w:r>
+              <w:rPr>
+                <w:rFonts w:ascii="Times New Roman" w:hAnsi="Times New Roman" w:cs="Times New Roman" w:eastAsia="宋体"/>
+                <w:sz w:val="21"/>
+              </w:rPr>
+              <w:t>1,500 个语义/困难区域补样</w:t>
+            </w:r>
+          </w:p>
+        </w:tc>
+        <w:tc>
+          <w:tcPr>
+            <w:tcW w:type="dxa" w:w="3024"/>
+            <w:vAlign w:val="center"/>
+            <w:tcMar>
+              <w:top w:w="80" w:type="dxa"/>
+              <w:start w:w="80" w:type="dxa"/>
+              <w:bottom w:w="80" w:type="dxa"/>
+              <w:end w:w="80" w:type="dxa"/>
+            </w:tcMar>
+          </w:tcPr>
+          <w:p>
+            <w:pPr>
+              <w:jc w:val="center"/>
+            </w:pPr>
+            <w:r/>
+            <w:r>
+              <w:rPr>
+                <w:rFonts w:ascii="Times New Roman" w:hAnsi="Times New Roman" w:cs="Times New Roman" w:eastAsia="宋体"/>
+                <w:sz w:val="21"/>
+              </w:rPr>
+              <w:t>目标配额已确定</w:t>
+            </w:r>
+          </w:p>
+        </w:tc>
+        <w:tc>
+          <w:tcPr>
+            <w:tcW w:type="dxa" w:w="3024"/>
+            <w:vAlign w:val="center"/>
+            <w:tcMar>
+              <w:top w:w="80" w:type="dxa"/>
+              <w:start w:w="80" w:type="dxa"/>
+              <w:bottom w:w="80" w:type="dxa"/>
+              <w:end w:w="80" w:type="dxa"/>
+            </w:tcMar>
+          </w:tcPr>
+          <w:p>
+            <w:pPr>
+              <w:jc w:val="center"/>
+            </w:pPr>
+            <w:r/>
+            <w:r>
+              <w:rPr>
+                <w:rFonts w:ascii="Times New Roman" w:hAnsi="Times New Roman" w:cs="Times New Roman" w:eastAsia="宋体"/>
+                <w:sz w:val="21"/>
+              </w:rPr>
+              <w:t>否，选择器尚待实现</w:t>
+            </w:r>
+          </w:p>
+        </w:tc>
+      </w:tr>
+      <w:tr>
+        <w:trPr>
+          <w:cantSplit/>
+        </w:trPr>
+        <w:tc>
+          <w:tcPr>
+            <w:tcW w:type="dxa" w:w="3024"/>
+            <w:vAlign w:val="center"/>
+            <w:tcMar>
+              <w:top w:w="80" w:type="dxa"/>
+              <w:start w:w="80" w:type="dxa"/>
+              <w:bottom w:w="80" w:type="dxa"/>
+              <w:end w:w="80" w:type="dxa"/>
+            </w:tcMar>
+          </w:tcPr>
+          <w:p>
+            <w:pPr>
+              <w:jc w:val="center"/>
+            </w:pPr>
+            <w:r/>
+            <w:r>
+              <w:rPr>
+                <w:rFonts w:ascii="Times New Roman" w:hAnsi="Times New Roman" w:cs="Times New Roman" w:eastAsia="宋体"/>
+                <w:sz w:val="21"/>
+              </w:rPr>
+              <w:t>62,000 点最终注册表</w:t>
+            </w:r>
+          </w:p>
+        </w:tc>
+        <w:tc>
+          <w:tcPr>
+            <w:tcW w:type="dxa" w:w="3024"/>
+            <w:vAlign w:val="center"/>
+            <w:tcMar>
+              <w:top w:w="80" w:type="dxa"/>
+              <w:start w:w="80" w:type="dxa"/>
+              <w:bottom w:w="80" w:type="dxa"/>
+              <w:end w:w="80" w:type="dxa"/>
+            </w:tcMar>
+          </w:tcPr>
+          <w:p>
+            <w:pPr>
+              <w:jc w:val="center"/>
+            </w:pPr>
+            <w:r/>
+            <w:r>
+              <w:rPr>
+                <w:rFonts w:ascii="Times New Roman" w:hAnsi="Times New Roman" w:cs="Times New Roman" w:eastAsia="宋体"/>
+                <w:sz w:val="21"/>
+              </w:rPr>
+              <w:t>尚未物化</w:t>
+            </w:r>
+          </w:p>
+        </w:tc>
+        <w:tc>
+          <w:tcPr>
+            <w:tcW w:type="dxa" w:w="3024"/>
+            <w:vAlign w:val="center"/>
+            <w:tcMar>
+              <w:top w:w="80" w:type="dxa"/>
+              <w:start w:w="80" w:type="dxa"/>
+              <w:bottom w:w="80" w:type="dxa"/>
+              <w:end w:w="80" w:type="dxa"/>
+            </w:tcMar>
+          </w:tcPr>
+          <w:p>
+            <w:pPr>
+              <w:jc w:val="center"/>
+            </w:pPr>
+            <w:r/>
+            <w:r>
+              <w:rPr>
+                <w:rFonts w:ascii="Times New Roman" w:hAnsi="Times New Roman" w:cs="Times New Roman" w:eastAsia="宋体"/>
+                <w:sz w:val="21"/>
+              </w:rPr>
+              <w:t>否，必须通过本文全部验收门槛</w:t>
+            </w:r>
+          </w:p>
+        </w:tc>
+      </w:tr>
+      <w:tr>
+        <w:trPr>
+          <w:cantSplit/>
+        </w:trPr>
+        <w:tc>
+          <w:tcPr>
+            <w:tcW w:type="dxa" w:w="3024"/>
+            <w:vAlign w:val="center"/>
+            <w:tcMar>
+              <w:top w:w="80" w:type="dxa"/>
+              <w:start w:w="80" w:type="dxa"/>
+              <w:bottom w:w="80" w:type="dxa"/>
+              <w:end w:w="80" w:type="dxa"/>
+            </w:tcMar>
+          </w:tcPr>
+          <w:p>
+            <w:pPr>
+              <w:jc w:val="center"/>
+            </w:pPr>
+            <w:r/>
+            <w:r>
+              <w:rPr>
+                <w:rFonts w:ascii="Times New Roman" w:hAnsi="Times New Roman" w:cs="Times New Roman" w:eastAsia="宋体"/>
+                <w:sz w:val="21"/>
+              </w:rPr>
+              <w:t>2020Q1--2021Q4 季度数据</w:t>
+            </w:r>
+          </w:p>
+        </w:tc>
+        <w:tc>
+          <w:tcPr>
+            <w:tcW w:type="dxa" w:w="3024"/>
+            <w:vAlign w:val="center"/>
+            <w:tcMar>
+              <w:top w:w="80" w:type="dxa"/>
+              <w:start w:w="80" w:type="dxa"/>
+              <w:bottom w:w="80" w:type="dxa"/>
+              <w:end w:w="80" w:type="dxa"/>
+            </w:tcMar>
+          </w:tcPr>
+          <w:p>
+            <w:pPr>
+              <w:jc w:val="center"/>
+            </w:pPr>
+            <w:r/>
+            <w:r>
+              <w:rPr>
+                <w:rFonts w:ascii="Times New Roman" w:hAnsi="Times New Roman" w:cs="Times New Roman" w:eastAsia="宋体"/>
+                <w:sz w:val="21"/>
+              </w:rPr>
+              <w:t>数据方案已确定</w:t>
+            </w:r>
+          </w:p>
+        </w:tc>
+        <w:tc>
+          <w:tcPr>
+            <w:tcW w:type="dxa" w:w="3024"/>
+            <w:vAlign w:val="center"/>
+            <w:tcMar>
+              <w:top w:w="80" w:type="dxa"/>
+              <w:start w:w="80" w:type="dxa"/>
+              <w:bottom w:w="80" w:type="dxa"/>
+              <w:end w:w="80" w:type="dxa"/>
+            </w:tcMar>
+          </w:tcPr>
+          <w:p>
+            <w:pPr>
+              <w:jc w:val="center"/>
+            </w:pPr>
+            <w:r/>
+            <w:r>
+              <w:rPr>
+                <w:rFonts w:ascii="Times New Roman" w:hAnsi="Times New Roman" w:cs="Times New Roman" w:eastAsia="宋体"/>
+                <w:sz w:val="21"/>
+              </w:rPr>
+              <w:t>否，季度合成与质量汇总链路尚待实现</w:t>
+            </w:r>
+          </w:p>
+        </w:tc>
+      </w:tr>
+    </w:tbl>
+    <w:p>
+      <w:r>
+        <w:rPr>
+          <w:rFonts w:ascii="Times New Roman" w:hAnsi="Times New Roman" w:cs="Times New Roman" w:eastAsia="宋体"/>
+          <w:sz w:val="24"/>
+        </w:rPr>
+        <w:t>本文是正式采样口径和实施规范，不把规划配额表述为已经完成的数据成果。</w:t>
+      </w:r>
+    </w:p>
+    <w:p>
+      <w:r>
+        <w:br w:type="page"/>
+      </w:r>
+    </w:p>
+    <w:p>
+      <w:pPr>
+        <w:jc w:val="center"/>
+      </w:pPr>
+      <w:r>
+        <w:rPr>
+          <w:rFonts w:ascii="Times New Roman" w:hAnsi="Times New Roman" w:cs="Times New Roman" w:eastAsia="宋体"/>
+          <w:b/>
+          <w:sz w:val="28"/>
+        </w:rPr>
+        <w:t>目录</w:t>
+      </w:r>
+    </w:p>
+    <w:p>
+      <w:r>
+        <w:fldChar w:fldCharType="begin"/>
+        <w:instrText xml:space="preserve"> TOC \o "1-3" \h \z \u </w:instrText>
+        <w:fldChar w:fldCharType="separate"/>
+        <w:t>请在 Word/WPS 中更新目录</w:t>
+        <w:fldChar w:fldCharType="end"/>
+      </w:r>
+    </w:p>
+    <w:p>
+      <w:r>
+        <w:br w:type="page"/>
       </w:r>
     </w:p>
     <w:p>
@@ -89,7 +675,7 @@
           <w:rFonts w:ascii="Times New Roman" w:hAnsi="Times New Roman" w:cs="Times New Roman" w:eastAsia="宋体"/>
           <w:sz w:val="24"/>
         </w:rPr>
-        <w:t>全国陆地完整覆盖约有 586 万个 1,280 米 patch。首版不把全国所有 patch 都 送入训练，而是建立一套约占全国 1.06% 的代表性空间样本。采样首先保证全国 均匀覆盖，再补充容易被均匀采样漏掉的海岸、城市、稀有自然地物、基础设施和 困难观测区。</w:t>
+        <w:t>按 960 万平方千米面积换算，全国陆地约有 586 万个 1,280 米 patch；现有宏 网格清单的面积等效估计约为 574 万个。两个数字都不是去除 UTM 重叠后的整数 总体，最终比例必须在全国唯一候选枚举完成后重算。首版采用“空间概率骨架加 目标补样”，加强海岸、城市、稀有自然地物、基础设施和困难观测区。</w:t>
       </w:r>
     </w:p>
     <w:p>
@@ -98,7 +684,7 @@
           <w:rFonts w:ascii="Times New Roman" w:hAnsi="Times New Roman" w:cs="Times New Roman" w:eastAsia="宋体"/>
           <w:sz w:val="24"/>
         </w:rPr>
-        <w:t>这 62,000 个位置是固定的空间骨架。Sentinel-2、Sentinel-1、Landsat 和其他 可用数据按相同位置分别整理 2020Q1 至 2021Q4 的季度观测。这样可以同时控制 数据规模、保持全国代表性，并保证八期嵌入在空间上可以直接比较。</w:t>
+        <w:t>候选层先形成 62,000 个主候选和分层候补池；完成几何与季度质量验收后，才冻结 最终 62,000 个位置。Sentinel-2、Sentinel-1、Landsat 和其他可用数据按相同 位置整理 2020Q1 至 2021Q4 的季度观测。目标补样不是概率样本，不能用于全国 统计推断；全国面积分布或总体性能只在基础概率层上报告。</w:t>
       </w:r>
     </w:p>
     <w:p>
@@ -112,7 +698,7 @@
           <w:b/>
           <w:sz w:val="28"/>
         </w:rPr>
-        <w:t>二、最终样本组成</w:t>
+        <w:t>二、目标样本组成</w:t>
       </w:r>
     </w:p>
     <w:tbl>
@@ -124,15 +710,19 @@
         <w:tblLook w:firstColumn="1" w:firstRow="1" w:lastColumn="0" w:lastRow="0" w:noHBand="0" w:noVBand="1" w:val="04A0"/>
       </w:tblPr>
       <w:tblGrid>
-        <w:gridCol w:w="2351"/>
-        <w:gridCol w:w="2351"/>
-        <w:gridCol w:w="2351"/>
-        <w:gridCol w:w="2351"/>
+        <w:gridCol w:w="2268"/>
+        <w:gridCol w:w="2268"/>
+        <w:gridCol w:w="2268"/>
+        <w:gridCol w:w="2268"/>
       </w:tblGrid>
       <w:tr>
+        <w:trPr>
+          <w:cantSplit/>
+          <w:tblHeader w:val="true"/>
+        </w:trPr>
         <w:tc>
           <w:tcPr>
-            <w:tcW w:type="dxa" w:w="2351"/>
+            <w:tcW w:type="dxa" w:w="2268"/>
             <w:vAlign w:val="center"/>
             <w:tcMar>
               <w:top w:w="80" w:type="dxa"/>
@@ -163,7 +753,7 @@
         </w:tc>
         <w:tc>
           <w:tcPr>
-            <w:tcW w:type="dxa" w:w="2351"/>
+            <w:tcW w:type="dxa" w:w="2268"/>
             <w:vAlign w:val="center"/>
             <w:tcMar>
               <w:top w:w="80" w:type="dxa"/>
@@ -188,13 +778,13 @@
                 <w:b/>
                 <w:sz w:val="21"/>
               </w:rPr>
-              <w:t>数量</w:t>
+              <w:t>目标数量</w:t>
             </w:r>
           </w:p>
         </w:tc>
         <w:tc>
           <w:tcPr>
-            <w:tcW w:type="dxa" w:w="2351"/>
+            <w:tcW w:type="dxa" w:w="2268"/>
             <w:vAlign w:val="center"/>
             <w:tcMar>
               <w:top w:w="80" w:type="dxa"/>
@@ -219,13 +809,13 @@
                 <w:b/>
                 <w:sz w:val="21"/>
               </w:rPr>
-              <w:t>占最终样本</w:t>
+              <w:t>占目标样本</w:t>
             </w:r>
           </w:p>
         </w:tc>
         <w:tc>
           <w:tcPr>
-            <w:tcW w:type="dxa" w:w="2351"/>
+            <w:tcW w:type="dxa" w:w="2268"/>
             <w:vAlign w:val="center"/>
             <w:tcMar>
               <w:top w:w="80" w:type="dxa"/>
@@ -256,9 +846,12 @@
         </w:tc>
       </w:tr>
       <w:tr>
+        <w:trPr>
+          <w:cantSplit/>
+        </w:trPr>
         <w:tc>
           <w:tcPr>
-            <w:tcW w:type="dxa" w:w="2351"/>
+            <w:tcW w:type="dxa" w:w="2268"/>
             <w:vAlign w:val="center"/>
             <w:tcMar>
               <w:top w:w="80" w:type="dxa"/>
@@ -283,7 +876,7 @@
         </w:tc>
         <w:tc>
           <w:tcPr>
-            <w:tcW w:type="dxa" w:w="2351"/>
+            <w:tcW w:type="dxa" w:w="2268"/>
             <w:vAlign w:val="center"/>
             <w:tcMar>
               <w:top w:w="80" w:type="dxa"/>
@@ -308,7 +901,7 @@
         </w:tc>
         <w:tc>
           <w:tcPr>
-            <w:tcW w:type="dxa" w:w="2351"/>
+            <w:tcW w:type="dxa" w:w="2268"/>
             <w:vAlign w:val="center"/>
             <w:tcMar>
               <w:top w:w="80" w:type="dxa"/>
@@ -333,7 +926,7 @@
         </w:tc>
         <w:tc>
           <w:tcPr>
-            <w:tcW w:type="dxa" w:w="2351"/>
+            <w:tcW w:type="dxa" w:w="2268"/>
             <w:vAlign w:val="center"/>
             <w:tcMar>
               <w:top w:w="80" w:type="dxa"/>
@@ -358,9 +951,12 @@
         </w:tc>
       </w:tr>
       <w:tr>
+        <w:trPr>
+          <w:cantSplit/>
+        </w:trPr>
         <w:tc>
           <w:tcPr>
-            <w:tcW w:type="dxa" w:w="2351"/>
+            <w:tcW w:type="dxa" w:w="2268"/>
             <w:vAlign w:val="center"/>
             <w:tcMar>
               <w:top w:w="80" w:type="dxa"/>
@@ -385,7 +981,7 @@
         </w:tc>
         <w:tc>
           <w:tcPr>
-            <w:tcW w:type="dxa" w:w="2351"/>
+            <w:tcW w:type="dxa" w:w="2268"/>
             <w:vAlign w:val="center"/>
             <w:tcMar>
               <w:top w:w="80" w:type="dxa"/>
@@ -410,7 +1006,7 @@
         </w:tc>
         <w:tc>
           <w:tcPr>
-            <w:tcW w:type="dxa" w:w="2351"/>
+            <w:tcW w:type="dxa" w:w="2268"/>
             <w:vAlign w:val="center"/>
             <w:tcMar>
               <w:top w:w="80" w:type="dxa"/>
@@ -435,7 +1031,7 @@
         </w:tc>
         <w:tc>
           <w:tcPr>
-            <w:tcW w:type="dxa" w:w="2351"/>
+            <w:tcW w:type="dxa" w:w="2268"/>
             <w:vAlign w:val="center"/>
             <w:tcMar>
               <w:top w:w="80" w:type="dxa"/>
@@ -460,9 +1056,12 @@
         </w:tc>
       </w:tr>
       <w:tr>
+        <w:trPr>
+          <w:cantSplit/>
+        </w:trPr>
         <w:tc>
           <w:tcPr>
-            <w:tcW w:type="dxa" w:w="2351"/>
+            <w:tcW w:type="dxa" w:w="2268"/>
             <w:vAlign w:val="center"/>
             <w:tcMar>
               <w:top w:w="80" w:type="dxa"/>
@@ -487,7 +1086,7 @@
         </w:tc>
         <w:tc>
           <w:tcPr>
-            <w:tcW w:type="dxa" w:w="2351"/>
+            <w:tcW w:type="dxa" w:w="2268"/>
             <w:vAlign w:val="center"/>
             <w:tcMar>
               <w:top w:w="80" w:type="dxa"/>
@@ -512,7 +1111,7 @@
         </w:tc>
         <w:tc>
           <w:tcPr>
-            <w:tcW w:type="dxa" w:w="2351"/>
+            <w:tcW w:type="dxa" w:w="2268"/>
             <w:vAlign w:val="center"/>
             <w:tcMar>
               <w:top w:w="80" w:type="dxa"/>
@@ -537,7 +1136,7 @@
         </w:tc>
         <w:tc>
           <w:tcPr>
-            <w:tcW w:type="dxa" w:w="2351"/>
+            <w:tcW w:type="dxa" w:w="2268"/>
             <w:vAlign w:val="center"/>
             <w:tcMar>
               <w:top w:w="80" w:type="dxa"/>
@@ -562,9 +1161,12 @@
         </w:tc>
       </w:tr>
       <w:tr>
+        <w:trPr>
+          <w:cantSplit/>
+        </w:trPr>
         <w:tc>
           <w:tcPr>
-            <w:tcW w:type="dxa" w:w="2351"/>
+            <w:tcW w:type="dxa" w:w="2268"/>
             <w:vAlign w:val="center"/>
             <w:tcMar>
               <w:top w:w="80" w:type="dxa"/>
@@ -589,7 +1191,7 @@
         </w:tc>
         <w:tc>
           <w:tcPr>
-            <w:tcW w:type="dxa" w:w="2351"/>
+            <w:tcW w:type="dxa" w:w="2268"/>
             <w:vAlign w:val="center"/>
             <w:tcMar>
               <w:top w:w="80" w:type="dxa"/>
@@ -614,7 +1216,7 @@
         </w:tc>
         <w:tc>
           <w:tcPr>
-            <w:tcW w:type="dxa" w:w="2351"/>
+            <w:tcW w:type="dxa" w:w="2268"/>
             <w:vAlign w:val="center"/>
             <w:tcMar>
               <w:top w:w="80" w:type="dxa"/>
@@ -639,7 +1241,7 @@
         </w:tc>
         <w:tc>
           <w:tcPr>
-            <w:tcW w:type="dxa" w:w="2351"/>
+            <w:tcW w:type="dxa" w:w="2268"/>
             <w:vAlign w:val="center"/>
             <w:tcMar>
               <w:top w:w="80" w:type="dxa"/>
@@ -664,9 +1266,12 @@
         </w:tc>
       </w:tr>
       <w:tr>
+        <w:trPr>
+          <w:cantSplit/>
+        </w:trPr>
         <w:tc>
           <w:tcPr>
-            <w:tcW w:type="dxa" w:w="2351"/>
+            <w:tcW w:type="dxa" w:w="2268"/>
             <w:vAlign w:val="center"/>
             <w:tcMar>
               <w:top w:w="80" w:type="dxa"/>
@@ -692,7 +1297,7 @@
         </w:tc>
         <w:tc>
           <w:tcPr>
-            <w:tcW w:type="dxa" w:w="2351"/>
+            <w:tcW w:type="dxa" w:w="2268"/>
             <w:vAlign w:val="center"/>
             <w:tcMar>
               <w:top w:w="80" w:type="dxa"/>
@@ -718,7 +1323,7 @@
         </w:tc>
         <w:tc>
           <w:tcPr>
-            <w:tcW w:type="dxa" w:w="2351"/>
+            <w:tcW w:type="dxa" w:w="2268"/>
             <w:vAlign w:val="center"/>
             <w:tcMar>
               <w:top w:w="80" w:type="dxa"/>
@@ -744,7 +1349,7 @@
         </w:tc>
         <w:tc>
           <w:tcPr>
-            <w:tcW w:type="dxa" w:w="2351"/>
+            <w:tcW w:type="dxa" w:w="2268"/>
             <w:vAlign w:val="center"/>
             <w:tcMar>
               <w:top w:w="80" w:type="dxa"/>
@@ -763,7 +1368,7 @@
                 <w:rFonts w:ascii="Times New Roman" w:hAnsi="Times New Roman" w:cs="Times New Roman" w:eastAsia="宋体"/>
                 <w:sz w:val="21"/>
               </w:rPr>
-              <w:t>约占全国完整网格的 1.06%</w:t>
+              <w:t>面积换算约 1.06%，现有清单估计约 1.08%，最终重算</w:t>
             </w:r>
           </w:p>
         </w:tc>
@@ -789,7 +1394,7 @@
                     <pic:cNvPicPr/>
                   </pic:nvPicPr>
                   <pic:blipFill>
-                    <a:blip r:embed="rId10"/>
+                    <a:blip r:embed="rId11"/>
                     <a:stretch>
                       <a:fillRect/>
                     </a:stretch>
@@ -818,14 +1423,14 @@
           <w:b/>
           <w:sz w:val="24"/>
         </w:rPr>
-        <w:t>图 1  62,000 点采样组成与执行流程。</w:t>
+        <w:t>图 1  62,000 点目标采样组成与执行流程。</w:t>
       </w:r>
       <w:r>
         <w:rPr>
           <w:rFonts w:ascii="Times New Roman" w:hAnsi="Times New Roman" w:cs="Times New Roman" w:eastAsia="宋体"/>
           <w:sz w:val="24"/>
         </w:rPr>
-        <w:t xml:space="preserve"> 上图表示四层样本的数量构成；下图 表示从全国规则网格、基础抽样、三类补样、质量审计到最终注册表的执行顺序。 补样只增加新 patch，不删除或替换已经选中的基础样本。</w:t>
+        <w:t xml:space="preserve"> 上图表示四层目标配额；下图 表示从全国规则网格、基础抽样、三类补样、质量审计到最终注册表的执行顺序。 补样只增加新 patch，不删除或替换已经选中的基础样本。</w:t>
       </w:r>
     </w:p>
     <w:p>
@@ -887,7 +1492,7 @@
           <w:rFonts w:ascii="Times New Roman" w:hAnsi="Times New Roman" w:cs="Times New Roman" w:eastAsia="宋体"/>
           <w:sz w:val="24"/>
         </w:rPr>
-        <w:t>每个 UTM 分区必须固定投影、网格原点和网格版本。位于分区交界处的 patch 只 保留一个归属，防止重复。patch 中心必须位于项目冻结的中国研究边界内，并保存 WGS84 和 UTM 两套范围。</w:t>
+        <w:t>每个 UTM 分区必须固定投影、网格原点和网格版本。patch 中心按经度半开区间 唯一归属一个 UTM 分区，不允许再落入相邻分区。所有候选还要转换到统一 WGS84 footprint，使用空间索引检查跨分区重叠；任意两个 patch 的相交面积超过任一 patch 面积的 1%时，只保留确定性哈希优先级更高者并从同层候补池补足。</w:t>
       </w:r>
     </w:p>
     <w:p>
@@ -933,7 +1538,63 @@
           <w:rFonts w:ascii="Times New Roman" w:hAnsi="Times New Roman" w:cs="Times New Roman" w:eastAsia="宋体"/>
           <w:sz w:val="24"/>
         </w:rPr>
-        <w:t>采样不依赖文件排列顺序。每个候选 patch 使用固定随机种子、宏网格 ID 和 patch ID 计算 SHA-256 哈希，按哈希值排序，选取排名第一的有效 patch。</w:t>
+        <w:t xml:space="preserve">采样不依赖文件排列顺序。固定随机种子为 </w:t>
+      </w:r>
+      <w:r>
+        <w:rPr>
+          <w:rFonts w:ascii="Times New Roman" w:hAnsi="Times New Roman" w:cs="Times New Roman" w:eastAsia="宋体"/>
+          <w:sz w:val="24"/>
+        </w:rPr>
+        <w:t>20260717</w:t>
+      </w:r>
+      <w:r>
+        <w:rPr>
+          <w:rFonts w:ascii="Times New Roman" w:hAnsi="Times New Roman" w:cs="Times New Roman" w:eastAsia="宋体"/>
+          <w:sz w:val="24"/>
+        </w:rPr>
+        <w:t xml:space="preserve">。宏网格接纳哈希与内部 patch 排序哈希使用不同域前缀；输入统一按 UTF-8 编码为 </w:t>
+      </w:r>
+      <w:r>
+        <w:rPr>
+          <w:rFonts w:ascii="Times New Roman" w:hAnsi="Times New Roman" w:cs="Times New Roman" w:eastAsia="宋体"/>
+          <w:sz w:val="24"/>
+        </w:rPr>
+        <w:t>用途|种子|边界版本|宏网格ID|候选ID</w:t>
+      </w:r>
+      <w:r>
+        <w:rPr>
+          <w:rFonts w:ascii="Times New Roman" w:hAnsi="Times New Roman" w:cs="Times New Roman" w:eastAsia="宋体"/>
+          <w:sz w:val="24"/>
+        </w:rPr>
+        <w:t xml:space="preserve">。取 SHA-256 前 8 字节无符号大端整数， 除以 </w:t>
+      </w:r>
+      <w:r>
+        <w:rPr>
+          <w:rFonts w:ascii="Times New Roman" w:hAnsi="Times New Roman" w:cs="Times New Roman" w:eastAsia="宋体"/>
+          <w:sz w:val="24"/>
+        </w:rPr>
+        <w:t>2^64</w:t>
+      </w:r>
+      <w:r>
+        <w:rPr>
+          <w:rFonts w:ascii="Times New Roman" w:hAnsi="Times New Roman" w:cs="Times New Roman" w:eastAsia="宋体"/>
+          <w:sz w:val="24"/>
+        </w:rPr>
+        <w:t xml:space="preserve"> 映射到 </w:t>
+      </w:r>
+      <w:r>
+        <w:rPr>
+          <w:rFonts w:ascii="Times New Roman" w:hAnsi="Times New Roman" w:cs="Times New Roman" w:eastAsia="宋体"/>
+          <w:sz w:val="24"/>
+        </w:rPr>
+        <w:t>[0,1)</w:t>
+      </w:r>
+      <w:r>
+        <w:rPr>
+          <w:rFonts w:ascii="Times New Roman" w:hAnsi="Times New Roman" w:cs="Times New Roman" w:eastAsia="宋体"/>
+          <w:sz w:val="24"/>
+        </w:rPr>
+        <w:t>。候选排序按该值升序，并以 patch ID 作为并列 次序。</w:t>
       </w:r>
     </w:p>
     <w:p>
@@ -988,7 +1649,21 @@
           <w:rFonts w:ascii="Times New Roman" w:hAnsi="Times New Roman" w:cs="Times New Roman" w:eastAsia="宋体"/>
           <w:sz w:val="24"/>
         </w:rPr>
-        <w:t xml:space="preserve">本方案先以 </w:t>
+        <w:t xml:space="preserve">本方案逐个枚举宏网格内 100 个中心，根据唯一 UTM 归属和冻结国界得到准确整数 </w:t>
+      </w:r>
+      <w:r>
+        <w:rPr>
+          <w:rFonts w:ascii="Times New Roman" w:hAnsi="Times New Roman" w:cs="Times New Roman" w:eastAsia="宋体"/>
+          <w:sz w:val="24"/>
+        </w:rPr>
+        <w:t>n</w:t>
+      </w:r>
+      <w:r>
+        <w:rPr>
+          <w:rFonts w:ascii="Times New Roman" w:hAnsi="Times New Roman" w:cs="Times New Roman" w:eastAsia="宋体"/>
+          <w:sz w:val="24"/>
+        </w:rPr>
+        <w:t xml:space="preserve">，再以 </w:t>
       </w:r>
       <w:r>
         <w:rPr>
@@ -1002,7 +1677,7 @@
           <w:rFonts w:ascii="Times New Roman" w:hAnsi="Times New Roman" w:cs="Times New Roman" w:eastAsia="宋体"/>
           <w:sz w:val="24"/>
         </w:rPr>
-        <w:t xml:space="preserve"> 的概率接纳该宏网格。宏网格被接纳后，再从其中选择 SHA-256 哈希排名第一的有效 patch。这样每个有效 patch 的期望入选概率仍为 1%。</w:t>
+        <w:t xml:space="preserve"> 的概率接纳该宏网格。宏网格被接纳后，再从其中选择 SHA-256 哈希排名第一的有效 patch。初始设计中每个有效 patch 的期望入选概率 约为 1%。跨 UTM 去重后，从基础层有序候补池确定性补足到规划数量 57,405； 这一步会轻微改变边界 patch 的最终入选概率，因此注册表先保存名义入选概率； 实际概率和权重只在概率设计实现并审计后填写。混合样本不能用于全国统计推断。</w:t>
       </w:r>
     </w:p>
     <w:p>
@@ -1011,7 +1686,21 @@
           <w:rFonts w:ascii="Times New Roman" w:hAnsi="Times New Roman" w:cs="Times New Roman" w:eastAsia="宋体"/>
           <w:sz w:val="24"/>
         </w:rPr>
-        <w:t>经过边界和完整 patch 检查后，现有基础空间样本为 57,405 个。</w:t>
+        <w:t xml:space="preserve">现有 57,405 个点是种子 </w:t>
+      </w:r>
+      <w:r>
+        <w:rPr>
+          <w:rFonts w:ascii="Times New Roman" w:hAnsi="Times New Roman" w:cs="Times New Roman" w:eastAsia="宋体"/>
+          <w:sz w:val="24"/>
+        </w:rPr>
+        <w:t>20260717</w:t>
+      </w:r>
+      <w:r>
+        <w:rPr>
+          <w:rFonts w:ascii="Times New Roman" w:hAnsi="Times New Roman" w:cs="Times New Roman" w:eastAsia="宋体"/>
+          <w:sz w:val="24"/>
+        </w:rPr>
+        <w:t xml:space="preserve"> 下得到的中心点静态候选。基础数量是概率 抽样的实现值，不是理论上必然等于 57,405 的固定配额。当前清单尚未完成完整 footprint、跨 UTM 重叠和八季度质量检查。</w:t>
       </w:r>
     </w:p>
     <w:p>
@@ -1021,7 +1710,7 @@
       <w:r>
         <w:drawing>
           <wp:inline xmlns:a="http://schemas.openxmlformats.org/drawingml/2006/main" xmlns:pic="http://schemas.openxmlformats.org/drawingml/2006/picture">
-            <wp:extent cx="5577840" cy="3472320"/>
+            <wp:extent cx="5577840" cy="3471065"/>
             <wp:docPr id="2" name="Picture 2"/>
             <wp:cNvGraphicFramePr>
               <a:graphicFrameLocks noChangeAspect="1"/>
@@ -1030,11 +1719,11 @@
               <a:graphicData uri="http://schemas.openxmlformats.org/drawingml/2006/picture">
                 <pic:pic>
                   <pic:nvPicPr>
-                    <pic:cNvPr id="0" name="national_static_1pct_sampling_preview.png"/>
+                    <pic:cNvPr id="0" name="national_base_candidate_preview_internal.png"/>
                     <pic:cNvPicPr/>
                   </pic:nvPicPr>
                   <pic:blipFill>
-                    <a:blip r:embed="rId11"/>
+                    <a:blip r:embed="rId12"/>
                     <a:stretch>
                       <a:fillRect/>
                     </a:stretch>
@@ -1042,7 +1731,7 @@
                   <pic:spPr>
                     <a:xfrm>
                       <a:off x="0" y="0"/>
-                      <a:ext cx="5577840" cy="3472320"/>
+                      <a:ext cx="5577840" cy="3471065"/>
                     </a:xfrm>
                     <a:prstGeom prst="rect"/>
                   </pic:spPr>
@@ -1070,7 +1759,7 @@
           <w:rFonts w:ascii="Times New Roman" w:hAnsi="Times New Roman" w:cs="Times New Roman" w:eastAsia="宋体"/>
           <w:sz w:val="24"/>
         </w:rPr>
-        <w:t xml:space="preserve"> 红点表示 57,405 个通过静态国界几何 检查的基础候选 patch 中心。该图是基础空间层预览，尚未加入 2,595 个空间 均衡样本、500 个海岸样本和 1,500 个语义/困难区域样本，也没有替代季度影像 质量审计，因此不能标注为最终训练样本分布。</w:t>
+        <w:t xml:space="preserve"> 红点表示 57,405 个中心位于静态国界内 的基础候选。该图是内部技术预览，不是标准地图，禁止直接用于对外发布；正式 公开材料须更换为带审图号的标准地图底图。该图尚未加入 2,595 个空间 均衡样本、500 个海岸样本和 1,500 个语义/困难区域样本，也没有替代季度影像 质量审计，因此不能标注为最终训练样本分布。</w:t>
       </w:r>
     </w:p>
     <w:p>
@@ -1107,7 +1796,7 @@
           <w:rFonts w:ascii="Times New Roman" w:hAnsi="Times New Roman" w:cs="Times New Roman" w:eastAsia="宋体"/>
           <w:sz w:val="24"/>
         </w:rPr>
-        <w:t>基础 1% 抽样完成后，将样本补到 60,000 个。新增数量按照各 UTM 分区有效面积 的平方根分配：</w:t>
+        <w:t>基础 1% 抽样完成后，目标是补到 60,000 个。补样不能只填充没有基础点的边界 宏网格，而要从全国所有未入选 patch 中选择；允许在已有基础点的宏网格增加 一个补样，但所有补样层合计每个宏网格最多增加一个。新增数量按照各 UTM 分区 去重后的准确有效候选数平方根分配：</w:t>
       </w:r>
     </w:p>
     <w:p>
@@ -1119,7 +1808,7 @@
           <w:rFonts w:ascii="Times New Roman" w:hAnsi="Times New Roman" w:cs="Times New Roman" w:eastAsia="宋体"/>
           <w:sz w:val="21"/>
         </w:rPr>
-        <w:t>分区配额 = 2,595 × sqrt(分区有效面积) / Σsqrt(各分区有效面积)</w:t>
+        <w:t>分区配额 = 2,595 × sqrt(分区有效候选数) / Σsqrt(各分区有效候选数)</w:t>
       </w:r>
     </w:p>
     <w:p>
@@ -1128,7 +1817,7 @@
           <w:rFonts w:ascii="Times New Roman" w:hAnsi="Times New Roman" w:cs="Times New Roman" w:eastAsia="宋体"/>
           <w:sz w:val="24"/>
         </w:rPr>
-        <w:t>使用平方根而不是直接按面积分配，可以让大区域获得更多样本，同时避免面积较小 的 UTM 分区没有补样。分配整数配额时使用最大余数法。每个分区至少保留基本 配额，剩余名额按小数余数从大到小补齐。</w:t>
+        <w:t>使用平方根而不是直接按面积分配，可以让大区域获得更多样本，同时避免面积较小 的 UTM 分区没有补样。每个有候选的分区先分配 1 个基础名额，剩余名额使用 最大余数法；余数相同时按 UTM 编号升序。发布时必须附逐分区候选数、原始配额、 整数配额和实际完成数。</w:t>
       </w:r>
     </w:p>
     <w:p>
@@ -1161,7 +1850,7 @@
           <w:rFonts w:ascii="Times New Roman" w:hAnsi="Times New Roman" w:cs="Times New Roman" w:eastAsia="宋体"/>
           <w:sz w:val="24"/>
         </w:rPr>
-        <w:t>2. patch ID 和 geometry hash 均不重复。</w:t>
+        <w:t>2. patch ID、身份 hash 和规范化 WGS84 footprint hash 均不重复。</w:t>
       </w:r>
     </w:p>
     <w:p>
@@ -1173,7 +1862,7 @@
           <w:rFonts w:ascii="Times New Roman" w:hAnsi="Times New Roman" w:cs="Times New Roman" w:eastAsia="宋体"/>
           <w:sz w:val="24"/>
         </w:rPr>
-        <w:t>3. 每个宏网格原则上最多新增一个 patch。</w:t>
+        <w:t>3. 四个补样层合计每个宏网格最多新增一个 patch。</w:t>
       </w:r>
     </w:p>
     <w:p>
@@ -1217,7 +1906,7 @@
           <w:rFonts w:ascii="Times New Roman" w:hAnsi="Times New Roman" w:cs="Times New Roman" w:eastAsia="宋体"/>
           <w:sz w:val="24"/>
         </w:rPr>
-        <w:t>候选 patch 需要同时接近陆地和海洋面，建议初始搜索距离为海洋面 3--4 km 以内。500 个名额按沿海 UTM 分区分配，并检查省域分布。河流两岸、湖泊边缘、 省界和陆地国界全部排除。</w:t>
+        <w:t>候选 patch 的 footprint 必须同时与冻结陆地面和海洋面相交。距离和面积全部 在局部米制 CRS 中计算，不使用固定经纬度差近似千米。500 个名额按沿海 UTM 分区分配，并检查省域和海岸类型分布。河流两岸、湖泊边缘、 省界和陆地国界全部排除。</w:t>
       </w:r>
     </w:p>
     <w:p>
@@ -1309,7 +1998,7 @@
           <w:rFonts w:ascii="Times New Roman" w:hAnsi="Times New Roman" w:cs="Times New Roman" w:eastAsia="宋体"/>
           <w:sz w:val="24"/>
         </w:rPr>
-        <w:t>这 1,500 个样本在前 60,500 个样本基础上直接增加，不删除、不替换已有样本。</w:t>
+        <w:t>这 1,500 个样本在按本方案重建的前 60,500 个候选基础上直接增加，不删除、 不替换已通过几何检查的主候选。</w:t>
       </w:r>
     </w:p>
     <w:tbl>
@@ -1321,14 +2010,18 @@
         <w:tblLook w:firstColumn="1" w:firstRow="1" w:lastColumn="0" w:lastRow="0" w:noHBand="0" w:noVBand="1" w:val="04A0"/>
       </w:tblPr>
       <w:tblGrid>
-        <w:gridCol w:w="3135"/>
-        <w:gridCol w:w="3135"/>
-        <w:gridCol w:w="3135"/>
+        <w:gridCol w:w="3024"/>
+        <w:gridCol w:w="3024"/>
+        <w:gridCol w:w="3024"/>
       </w:tblGrid>
       <w:tr>
+        <w:trPr>
+          <w:cantSplit/>
+          <w:tblHeader w:val="true"/>
+        </w:trPr>
         <w:tc>
           <w:tcPr>
-            <w:tcW w:type="dxa" w:w="3135"/>
+            <w:tcW w:type="dxa" w:w="3024"/>
             <w:vAlign w:val="center"/>
             <w:tcMar>
               <w:top w:w="80" w:type="dxa"/>
@@ -1359,7 +2052,7 @@
         </w:tc>
         <w:tc>
           <w:tcPr>
-            <w:tcW w:type="dxa" w:w="3135"/>
+            <w:tcW w:type="dxa" w:w="3024"/>
             <w:vAlign w:val="center"/>
             <w:tcMar>
               <w:top w:w="80" w:type="dxa"/>
@@ -1390,7 +2083,7 @@
         </w:tc>
         <w:tc>
           <w:tcPr>
-            <w:tcW w:type="dxa" w:w="3135"/>
+            <w:tcW w:type="dxa" w:w="3024"/>
             <w:vAlign w:val="center"/>
             <w:tcMar>
               <w:top w:w="80" w:type="dxa"/>
@@ -1421,9 +2114,12 @@
         </w:tc>
       </w:tr>
       <w:tr>
+        <w:trPr>
+          <w:cantSplit/>
+        </w:trPr>
         <w:tc>
           <w:tcPr>
-            <w:tcW w:type="dxa" w:w="3135"/>
+            <w:tcW w:type="dxa" w:w="3024"/>
             <w:vAlign w:val="center"/>
             <w:tcMar>
               <w:top w:w="80" w:type="dxa"/>
@@ -1448,7 +2144,7 @@
         </w:tc>
         <w:tc>
           <w:tcPr>
-            <w:tcW w:type="dxa" w:w="3135"/>
+            <w:tcW w:type="dxa" w:w="3024"/>
             <w:vAlign w:val="center"/>
             <w:tcMar>
               <w:top w:w="80" w:type="dxa"/>
@@ -1473,7 +2169,7 @@
         </w:tc>
         <w:tc>
           <w:tcPr>
-            <w:tcW w:type="dxa" w:w="3135"/>
+            <w:tcW w:type="dxa" w:w="3024"/>
             <w:vAlign w:val="center"/>
             <w:tcMar>
               <w:top w:w="80" w:type="dxa"/>
@@ -1498,9 +2194,12 @@
         </w:tc>
       </w:tr>
       <w:tr>
+        <w:trPr>
+          <w:cantSplit/>
+        </w:trPr>
         <w:tc>
           <w:tcPr>
-            <w:tcW w:type="dxa" w:w="3135"/>
+            <w:tcW w:type="dxa" w:w="3024"/>
             <w:vAlign w:val="center"/>
             <w:tcMar>
               <w:top w:w="80" w:type="dxa"/>
@@ -1525,7 +2224,7 @@
         </w:tc>
         <w:tc>
           <w:tcPr>
-            <w:tcW w:type="dxa" w:w="3135"/>
+            <w:tcW w:type="dxa" w:w="3024"/>
             <w:vAlign w:val="center"/>
             <w:tcMar>
               <w:top w:w="80" w:type="dxa"/>
@@ -1550,7 +2249,7 @@
         </w:tc>
         <w:tc>
           <w:tcPr>
-            <w:tcW w:type="dxa" w:w="3135"/>
+            <w:tcW w:type="dxa" w:w="3024"/>
             <w:vAlign w:val="center"/>
             <w:tcMar>
               <w:top w:w="80" w:type="dxa"/>
@@ -1575,9 +2274,12 @@
         </w:tc>
       </w:tr>
       <w:tr>
+        <w:trPr>
+          <w:cantSplit/>
+        </w:trPr>
         <w:tc>
           <w:tcPr>
-            <w:tcW w:type="dxa" w:w="3135"/>
+            <w:tcW w:type="dxa" w:w="3024"/>
             <w:vAlign w:val="center"/>
             <w:tcMar>
               <w:top w:w="80" w:type="dxa"/>
@@ -1602,7 +2304,7 @@
         </w:tc>
         <w:tc>
           <w:tcPr>
-            <w:tcW w:type="dxa" w:w="3135"/>
+            <w:tcW w:type="dxa" w:w="3024"/>
             <w:vAlign w:val="center"/>
             <w:tcMar>
               <w:top w:w="80" w:type="dxa"/>
@@ -1627,7 +2329,7 @@
         </w:tc>
         <w:tc>
           <w:tcPr>
-            <w:tcW w:type="dxa" w:w="3135"/>
+            <w:tcW w:type="dxa" w:w="3024"/>
             <w:vAlign w:val="center"/>
             <w:tcMar>
               <w:top w:w="80" w:type="dxa"/>
@@ -1652,9 +2354,12 @@
         </w:tc>
       </w:tr>
       <w:tr>
+        <w:trPr>
+          <w:cantSplit/>
+        </w:trPr>
         <w:tc>
           <w:tcPr>
-            <w:tcW w:type="dxa" w:w="3135"/>
+            <w:tcW w:type="dxa" w:w="3024"/>
             <w:vAlign w:val="center"/>
             <w:tcMar>
               <w:top w:w="80" w:type="dxa"/>
@@ -1679,7 +2384,7 @@
         </w:tc>
         <w:tc>
           <w:tcPr>
-            <w:tcW w:type="dxa" w:w="3135"/>
+            <w:tcW w:type="dxa" w:w="3024"/>
             <w:vAlign w:val="center"/>
             <w:tcMar>
               <w:top w:w="80" w:type="dxa"/>
@@ -1704,7 +2409,7 @@
         </w:tc>
         <w:tc>
           <w:tcPr>
-            <w:tcW w:type="dxa" w:w="3135"/>
+            <w:tcW w:type="dxa" w:w="3024"/>
             <w:vAlign w:val="center"/>
             <w:tcMar>
               <w:top w:w="80" w:type="dxa"/>
@@ -1729,9 +2434,12 @@
         </w:tc>
       </w:tr>
       <w:tr>
+        <w:trPr>
+          <w:cantSplit/>
+        </w:trPr>
         <w:tc>
           <w:tcPr>
-            <w:tcW w:type="dxa" w:w="3135"/>
+            <w:tcW w:type="dxa" w:w="3024"/>
             <w:vAlign w:val="center"/>
             <w:tcMar>
               <w:top w:w="80" w:type="dxa"/>
@@ -1757,7 +2465,7 @@
         </w:tc>
         <w:tc>
           <w:tcPr>
-            <w:tcW w:type="dxa" w:w="3135"/>
+            <w:tcW w:type="dxa" w:w="3024"/>
             <w:vAlign w:val="center"/>
             <w:tcMar>
               <w:top w:w="80" w:type="dxa"/>
@@ -1783,7 +2491,7 @@
         </w:tc>
         <w:tc>
           <w:tcPr>
-            <w:tcW w:type="dxa" w:w="3135"/>
+            <w:tcW w:type="dxa" w:w="3024"/>
             <w:vAlign w:val="center"/>
             <w:tcMar>
               <w:top w:w="80" w:type="dxa"/>
@@ -1814,7 +2522,7 @@
           <w:rFonts w:ascii="Times New Roman" w:hAnsi="Times New Roman" w:cs="Times New Roman" w:eastAsia="宋体"/>
           <w:sz w:val="24"/>
         </w:rPr>
-        <w:t>语义候选可以使用 WorldCover、Dynamic World、GLC_FCS30D、OSM 和 DEM 等 粗粒度信息评分，但不能使用最后用于下游评测的人工建筑、道路、水体等测试标签。 OSM 空白区域只表示“未知”，不能当作“没有该地物”的负样本。</w:t>
+        <w:t>语义候选可以使用 WorldCover、Dynamic World、GLC_FCS30D、历史 OSM 和 DEM 等 粗粒度信息评分，但不能使用最后用于下游评测的人工建筑、道路、水体等测试标签。 OSM 空白区域只表示“未知”，不能当作“没有该地物”的负样本。</w:t>
       </w:r>
     </w:p>
     <w:p>
@@ -1823,7 +2531,16 @@
           <w:rFonts w:ascii="Times New Roman" w:hAnsi="Times New Roman" w:cs="Times New Roman" w:eastAsia="宋体"/>
           <w:sz w:val="24"/>
         </w:rPr>
-        <w:t>同一子类中，任何单一省域或区域组原则上不超过 40%。候选不足时，先扩大同类 覆盖阈值，再按“困难观测区、稀有自然地物、城市和建成区”的顺序回填剩余名额， 但最终总量仍必须为 1,500。</w:t>
+        <w:t>每个入选 patch 只能计入一个主配额类，主类别优先级为稀有基础设施、稀有自然 地物、城市和建成区、困难观测区；其他命中保存为次级原因。四类配额均指新增 唯一 patch 数。候选不足时不得静默少选，必须从同类冻结候补池补足或提交配额 变更审批。</w:t>
+      </w:r>
+    </w:p>
+    <w:p>
+      <w:r>
+        <w:rPr>
+          <w:rFonts w:ascii="Times New Roman" w:hAnsi="Times New Roman" w:cs="Times New Roman" w:eastAsia="宋体"/>
+          <w:sz w:val="24"/>
+        </w:rPr>
+        <w:t>区域组固定为东北、华北、华东、华中、华南、西南和西北七组。同一子类中，任何 单一省域或区域组不超过 40%。候选不足时只能使用同类有序候补池；仍不足则提交 配额变更，不允许把别的类别静默改记为该类。</w:t>
       </w:r>
     </w:p>
     <w:p>
@@ -1849,15 +2566,19 @@
         <w:tblLook w:firstColumn="1" w:firstRow="1" w:lastColumn="0" w:lastRow="0" w:noHBand="0" w:noVBand="1" w:val="04A0"/>
       </w:tblPr>
       <w:tblGrid>
-        <w:gridCol w:w="2351"/>
-        <w:gridCol w:w="2351"/>
-        <w:gridCol w:w="2351"/>
-        <w:gridCol w:w="2351"/>
+        <w:gridCol w:w="2268"/>
+        <w:gridCol w:w="2268"/>
+        <w:gridCol w:w="2268"/>
+        <w:gridCol w:w="2268"/>
       </w:tblGrid>
       <w:tr>
+        <w:trPr>
+          <w:cantSplit/>
+          <w:tblHeader w:val="true"/>
+        </w:trPr>
         <w:tc>
           <w:tcPr>
-            <w:tcW w:type="dxa" w:w="2351"/>
+            <w:tcW w:type="dxa" w:w="2268"/>
             <w:vAlign w:val="center"/>
             <w:tcMar>
               <w:top w:w="80" w:type="dxa"/>
@@ -1888,7 +2609,7 @@
         </w:tc>
         <w:tc>
           <w:tcPr>
-            <w:tcW w:type="dxa" w:w="2351"/>
+            <w:tcW w:type="dxa" w:w="2268"/>
             <w:vAlign w:val="center"/>
             <w:tcMar>
               <w:top w:w="80" w:type="dxa"/>
@@ -1919,7 +2640,7 @@
         </w:tc>
         <w:tc>
           <w:tcPr>
-            <w:tcW w:type="dxa" w:w="2351"/>
+            <w:tcW w:type="dxa" w:w="2268"/>
             <w:vAlign w:val="center"/>
             <w:tcMar>
               <w:top w:w="80" w:type="dxa"/>
@@ -1950,7 +2671,7 @@
         </w:tc>
         <w:tc>
           <w:tcPr>
-            <w:tcW w:type="dxa" w:w="2351"/>
+            <w:tcW w:type="dxa" w:w="2268"/>
             <w:vAlign w:val="center"/>
             <w:tcMar>
               <w:top w:w="80" w:type="dxa"/>
@@ -1981,9 +2702,12 @@
         </w:tc>
       </w:tr>
       <w:tr>
+        <w:trPr>
+          <w:cantSplit/>
+        </w:trPr>
         <w:tc>
           <w:tcPr>
-            <w:tcW w:type="dxa" w:w="2351"/>
+            <w:tcW w:type="dxa" w:w="2268"/>
             <w:vAlign w:val="center"/>
             <w:tcMar>
               <w:top w:w="80" w:type="dxa"/>
@@ -2008,7 +2732,7 @@
         </w:tc>
         <w:tc>
           <w:tcPr>
-            <w:tcW w:type="dxa" w:w="2351"/>
+            <w:tcW w:type="dxa" w:w="2268"/>
             <w:vAlign w:val="center"/>
             <w:tcMar>
               <w:top w:w="80" w:type="dxa"/>
@@ -2033,7 +2757,7 @@
         </w:tc>
         <w:tc>
           <w:tcPr>
-            <w:tcW w:type="dxa" w:w="2351"/>
+            <w:tcW w:type="dxa" w:w="2268"/>
             <w:vAlign w:val="center"/>
             <w:tcMar>
               <w:top w:w="80" w:type="dxa"/>
@@ -2058,7 +2782,7 @@
         </w:tc>
         <w:tc>
           <w:tcPr>
-            <w:tcW w:type="dxa" w:w="2351"/>
+            <w:tcW w:type="dxa" w:w="2268"/>
             <w:vAlign w:val="center"/>
             <w:tcMar>
               <w:top w:w="80" w:type="dxa"/>
@@ -2083,9 +2807,12 @@
         </w:tc>
       </w:tr>
       <w:tr>
+        <w:trPr>
+          <w:cantSplit/>
+        </w:trPr>
         <w:tc>
           <w:tcPr>
-            <w:tcW w:type="dxa" w:w="2351"/>
+            <w:tcW w:type="dxa" w:w="2268"/>
             <w:vAlign w:val="center"/>
             <w:tcMar>
               <w:top w:w="80" w:type="dxa"/>
@@ -2110,7 +2837,7 @@
         </w:tc>
         <w:tc>
           <w:tcPr>
-            <w:tcW w:type="dxa" w:w="2351"/>
+            <w:tcW w:type="dxa" w:w="2268"/>
             <w:vAlign w:val="center"/>
             <w:tcMar>
               <w:top w:w="80" w:type="dxa"/>
@@ -2135,7 +2862,7 @@
         </w:tc>
         <w:tc>
           <w:tcPr>
-            <w:tcW w:type="dxa" w:w="2351"/>
+            <w:tcW w:type="dxa" w:w="2268"/>
             <w:vAlign w:val="center"/>
             <w:tcMar>
               <w:top w:w="80" w:type="dxa"/>
@@ -2160,7 +2887,7 @@
         </w:tc>
         <w:tc>
           <w:tcPr>
-            <w:tcW w:type="dxa" w:w="2351"/>
+            <w:tcW w:type="dxa" w:w="2268"/>
             <w:vAlign w:val="center"/>
             <w:tcMar>
               <w:top w:w="80" w:type="dxa"/>
@@ -2185,9 +2912,12 @@
         </w:tc>
       </w:tr>
       <w:tr>
+        <w:trPr>
+          <w:cantSplit/>
+        </w:trPr>
         <w:tc>
           <w:tcPr>
-            <w:tcW w:type="dxa" w:w="2351"/>
+            <w:tcW w:type="dxa" w:w="2268"/>
             <w:vAlign w:val="center"/>
             <w:tcMar>
               <w:top w:w="80" w:type="dxa"/>
@@ -2212,7 +2942,7 @@
         </w:tc>
         <w:tc>
           <w:tcPr>
-            <w:tcW w:type="dxa" w:w="2351"/>
+            <w:tcW w:type="dxa" w:w="2268"/>
             <w:vAlign w:val="center"/>
             <w:tcMar>
               <w:top w:w="80" w:type="dxa"/>
@@ -2237,7 +2967,7 @@
         </w:tc>
         <w:tc>
           <w:tcPr>
-            <w:tcW w:type="dxa" w:w="2351"/>
+            <w:tcW w:type="dxa" w:w="2268"/>
             <w:vAlign w:val="center"/>
             <w:tcMar>
               <w:top w:w="80" w:type="dxa"/>
@@ -2262,7 +2992,7 @@
         </w:tc>
         <w:tc>
           <w:tcPr>
-            <w:tcW w:type="dxa" w:w="2351"/>
+            <w:tcW w:type="dxa" w:w="2268"/>
             <w:vAlign w:val="center"/>
             <w:tcMar>
               <w:top w:w="80" w:type="dxa"/>
@@ -2287,9 +3017,12 @@
         </w:tc>
       </w:tr>
       <w:tr>
+        <w:trPr>
+          <w:cantSplit/>
+        </w:trPr>
         <w:tc>
           <w:tcPr>
-            <w:tcW w:type="dxa" w:w="2351"/>
+            <w:tcW w:type="dxa" w:w="2268"/>
             <w:vAlign w:val="center"/>
             <w:tcMar>
               <w:top w:w="80" w:type="dxa"/>
@@ -2314,7 +3047,7 @@
         </w:tc>
         <w:tc>
           <w:tcPr>
-            <w:tcW w:type="dxa" w:w="2351"/>
+            <w:tcW w:type="dxa" w:w="2268"/>
             <w:vAlign w:val="center"/>
             <w:tcMar>
               <w:top w:w="80" w:type="dxa"/>
@@ -2339,7 +3072,7 @@
         </w:tc>
         <w:tc>
           <w:tcPr>
-            <w:tcW w:type="dxa" w:w="2351"/>
+            <w:tcW w:type="dxa" w:w="2268"/>
             <w:vAlign w:val="center"/>
             <w:tcMar>
               <w:top w:w="80" w:type="dxa"/>
@@ -2364,7 +3097,7 @@
         </w:tc>
         <w:tc>
           <w:tcPr>
-            <w:tcW w:type="dxa" w:w="2351"/>
+            <w:tcW w:type="dxa" w:w="2268"/>
             <w:vAlign w:val="center"/>
             <w:tcMar>
               <w:top w:w="80" w:type="dxa"/>
@@ -2389,9 +3122,12 @@
         </w:tc>
       </w:tr>
       <w:tr>
+        <w:trPr>
+          <w:cantSplit/>
+        </w:trPr>
         <w:tc>
           <w:tcPr>
-            <w:tcW w:type="dxa" w:w="2351"/>
+            <w:tcW w:type="dxa" w:w="2268"/>
             <w:vAlign w:val="center"/>
             <w:tcMar>
               <w:top w:w="80" w:type="dxa"/>
@@ -2416,7 +3152,7 @@
         </w:tc>
         <w:tc>
           <w:tcPr>
-            <w:tcW w:type="dxa" w:w="2351"/>
+            <w:tcW w:type="dxa" w:w="2268"/>
             <w:vAlign w:val="center"/>
             <w:tcMar>
               <w:top w:w="80" w:type="dxa"/>
@@ -2441,7 +3177,7 @@
         </w:tc>
         <w:tc>
           <w:tcPr>
-            <w:tcW w:type="dxa" w:w="2351"/>
+            <w:tcW w:type="dxa" w:w="2268"/>
             <w:vAlign w:val="center"/>
             <w:tcMar>
               <w:top w:w="80" w:type="dxa"/>
@@ -2466,7 +3202,7 @@
         </w:tc>
         <w:tc>
           <w:tcPr>
-            <w:tcW w:type="dxa" w:w="2351"/>
+            <w:tcW w:type="dxa" w:w="2268"/>
             <w:vAlign w:val="center"/>
             <w:tcMar>
               <w:top w:w="80" w:type="dxa"/>
@@ -2491,9 +3227,12 @@
         </w:tc>
       </w:tr>
       <w:tr>
+        <w:trPr>
+          <w:cantSplit/>
+        </w:trPr>
         <w:tc>
           <w:tcPr>
-            <w:tcW w:type="dxa" w:w="2351"/>
+            <w:tcW w:type="dxa" w:w="2268"/>
             <w:vAlign w:val="center"/>
             <w:tcMar>
               <w:top w:w="80" w:type="dxa"/>
@@ -2518,7 +3257,7 @@
         </w:tc>
         <w:tc>
           <w:tcPr>
-            <w:tcW w:type="dxa" w:w="2351"/>
+            <w:tcW w:type="dxa" w:w="2268"/>
             <w:vAlign w:val="center"/>
             <w:tcMar>
               <w:top w:w="80" w:type="dxa"/>
@@ -2543,7 +3282,7 @@
         </w:tc>
         <w:tc>
           <w:tcPr>
-            <w:tcW w:type="dxa" w:w="2351"/>
+            <w:tcW w:type="dxa" w:w="2268"/>
             <w:vAlign w:val="center"/>
             <w:tcMar>
               <w:top w:w="80" w:type="dxa"/>
@@ -2568,7 +3307,7 @@
         </w:tc>
         <w:tc>
           <w:tcPr>
-            <w:tcW w:type="dxa" w:w="2351"/>
+            <w:tcW w:type="dxa" w:w="2268"/>
             <w:vAlign w:val="center"/>
             <w:tcMar>
               <w:top w:w="80" w:type="dxa"/>
@@ -2593,9 +3332,12 @@
         </w:tc>
       </w:tr>
       <w:tr>
+        <w:trPr>
+          <w:cantSplit/>
+        </w:trPr>
         <w:tc>
           <w:tcPr>
-            <w:tcW w:type="dxa" w:w="2351"/>
+            <w:tcW w:type="dxa" w:w="2268"/>
             <w:vAlign w:val="center"/>
             <w:tcMar>
               <w:top w:w="80" w:type="dxa"/>
@@ -2620,7 +3362,7 @@
         </w:tc>
         <w:tc>
           <w:tcPr>
-            <w:tcW w:type="dxa" w:w="2351"/>
+            <w:tcW w:type="dxa" w:w="2268"/>
             <w:vAlign w:val="center"/>
             <w:tcMar>
               <w:top w:w="80" w:type="dxa"/>
@@ -2645,7 +3387,7 @@
         </w:tc>
         <w:tc>
           <w:tcPr>
-            <w:tcW w:type="dxa" w:w="2351"/>
+            <w:tcW w:type="dxa" w:w="2268"/>
             <w:vAlign w:val="center"/>
             <w:tcMar>
               <w:top w:w="80" w:type="dxa"/>
@@ -2670,7 +3412,7 @@
         </w:tc>
         <w:tc>
           <w:tcPr>
-            <w:tcW w:type="dxa" w:w="2351"/>
+            <w:tcW w:type="dxa" w:w="2268"/>
             <w:vAlign w:val="center"/>
             <w:tcMar>
               <w:top w:w="80" w:type="dxa"/>
@@ -2695,9 +3437,12 @@
         </w:tc>
       </w:tr>
       <w:tr>
+        <w:trPr>
+          <w:cantSplit/>
+        </w:trPr>
         <w:tc>
           <w:tcPr>
-            <w:tcW w:type="dxa" w:w="2351"/>
+            <w:tcW w:type="dxa" w:w="2268"/>
             <w:vAlign w:val="center"/>
             <w:tcMar>
               <w:top w:w="80" w:type="dxa"/>
@@ -2722,7 +3467,7 @@
         </w:tc>
         <w:tc>
           <w:tcPr>
-            <w:tcW w:type="dxa" w:w="2351"/>
+            <w:tcW w:type="dxa" w:w="2268"/>
             <w:vAlign w:val="center"/>
             <w:tcMar>
               <w:top w:w="80" w:type="dxa"/>
@@ -2747,7 +3492,7 @@
         </w:tc>
         <w:tc>
           <w:tcPr>
-            <w:tcW w:type="dxa" w:w="2351"/>
+            <w:tcW w:type="dxa" w:w="2268"/>
             <w:vAlign w:val="center"/>
             <w:tcMar>
               <w:top w:w="80" w:type="dxa"/>
@@ -2772,7 +3517,7 @@
         </w:tc>
         <w:tc>
           <w:tcPr>
-            <w:tcW w:type="dxa" w:w="2351"/>
+            <w:tcW w:type="dxa" w:w="2268"/>
             <w:vAlign w:val="center"/>
             <w:tcMar>
               <w:top w:w="80" w:type="dxa"/>
@@ -2803,7 +3548,7 @@
           <w:rFonts w:ascii="Times New Roman" w:hAnsi="Times New Roman" w:cs="Times New Roman" w:eastAsia="宋体"/>
           <w:sz w:val="24"/>
         </w:rPr>
-        <w:t>空间位置不随季度改变。每个季度单独选择质量最好的有效观测并进行像素级合成。 国产高分影像、HJ、ZY、吉林一号和 Hi-GLASS 等数据按照本地实际覆盖作为可选 辅助模态，不要求每个 patch、每个季度都齐全。</w:t>
+        <w:t>空间位置不随季度改变。季度采用左闭右开的自然季度边界，不跨季度借景。每个 季度使用通过质量筛选的有效观测构建 medoid 合成，并为每个像素保存观测数、 最早日期、最晚日期和代表日期。 国产高分影像、HJ、ZY、吉林一号和 Hi-GLASS 等数据按照本地实际覆盖作为可选 辅助模态，不要求每个 patch、每个季度都齐全。</w:t>
       </w:r>
     </w:p>
     <w:p>
@@ -2812,7 +3557,7 @@
           <w:rFonts w:ascii="Times New Roman" w:hAnsi="Times New Roman" w:cs="Times New Roman" w:eastAsia="宋体"/>
           <w:sz w:val="24"/>
         </w:rPr>
-        <w:t>一年一期的土地覆盖、高程或指数产品不复制成虚假的季度变化。静态 DEM 作为 稳定物理条件输入；年度土地覆盖作为对应年份的弱语义；粗时间分辨率指数只在 其真实支持的季度参与训练，并带有效掩膜。</w:t>
+        <w:t>一年一期的土地覆盖、高程或指数产品不复制成虚假的季度变化。静态 DEM 作为 稳定物理条件输入；年度土地覆盖只监督年度聚合或稳定宽类，不监督季度变化。 WorldCover 2020 和 2021 的算法版本差异必须记录。Dynamic World 只作为带 置信度掩膜的同源伪标签，不作为独立验证真值。历史 OSM 使用 full history 重建八个季度末快照，只作为当期弱语义；编辑时间不解释为地物建成时间。</w:t>
       </w:r>
     </w:p>
     <w:p>
@@ -2835,7 +3580,7 @@
           <w:rFonts w:ascii="Times New Roman" w:hAnsi="Times New Roman" w:cs="Times New Roman" w:eastAsia="宋体"/>
           <w:sz w:val="24"/>
         </w:rPr>
-        <w:t>空间抽样和影像质量审计分两步执行。先冻结 62,000 个空间位置，再检查每个位置 八个季度的数据。不能为了追求 62,000 个“看起来完整”的样本，静默把多云或 缺测位置换成容易下载的位置。</w:t>
+        <w:t>空间抽样和影像质量审计分两步执行。先冻结 62,000 个主候选和各层有序候补池， 再检查每个位置八个季度的数据；质量验收与审计替补完成后，才冻结最终 62,000 点注册表。不能为了追求“看起来完整”，静默把多云或缺测位置换成容易下载的位置。</w:t>
       </w:r>
     </w:p>
     <w:p>
@@ -2849,7 +3594,7 @@
           <w:b/>
           <w:sz w:val="24"/>
         </w:rPr>
-        <w:t>1. 核心数据源</w:t>
+        <w:t>1. 优先核心数据源</w:t>
       </w:r>
     </w:p>
     <w:p>
@@ -2885,7 +3630,7 @@
           <w:rFonts w:ascii="Times New Roman" w:hAnsi="Times New Roman" w:cs="Times New Roman" w:eastAsia="宋体"/>
           <w:sz w:val="24"/>
         </w:rPr>
-        <w:t>3. Landsat-8：独立光学、热红外和质量信息。</w:t>
+        <w:t>3. Landsat-8：独立光学和质量信息；30 米数据重采样到 10 米不代表获得 10 米细节。</w:t>
       </w:r>
     </w:p>
     <w:p>
@@ -2898,6 +3643,15 @@
           <w:sz w:val="24"/>
         </w:rPr>
         <w:t>4. Landsat-9：仅补充 2021Q4，不能写入此前季度。</w:t>
+      </w:r>
+    </w:p>
+    <w:p>
+      <w:r>
+        <w:rPr>
+          <w:rFonts w:ascii="Times New Roman" w:hAnsi="Times New Roman" w:cs="Times New Roman" w:eastAsia="宋体"/>
+          <w:sz w:val="24"/>
+        </w:rPr>
+        <w:t>三类来源优先齐全，但不要求每个季度三源全部通过，否则会系统性排除长期多云和 困难区域。每季度至少有一个光学源和另一个模态达到最低门槛；缺失模态使用有效 掩膜，不计算对应重建损失。</w:t>
       </w:r>
     </w:p>
     <w:p>
@@ -2920,7 +3674,7 @@
           <w:rFonts w:ascii="Times New Roman" w:hAnsi="Times New Roman" w:cs="Times New Roman" w:eastAsia="宋体"/>
           <w:sz w:val="24"/>
         </w:rPr>
-        <w:t>每景光学影像必须保存并应用云、云影、雪、无效值、饱和和几何无效区域掩膜。 被掩膜的像素不参与重建损失。模型不能被要求把云雾当作真实地表进行重建。</w:t>
+        <w:t>每景光学影像必须保存云、云影、雪、无效值、饱和和几何无效区域掩膜。云、 云影、无效值、饱和和几何无效像素不参与重建损失。雪是有效季节地表状态， 单独保存 snow mask 并保留观测，不与云一起删除。</w:t>
       </w:r>
     </w:p>
     <w:p>
@@ -2943,30 +3697,592 @@
           <w:b/>
           <w:sz w:val="24"/>
         </w:rPr>
-        <w:t>3. 缺失数据处理</w:t>
+        <w:t>3. 可执行质量阈值</w:t>
       </w:r>
     </w:p>
+    <w:tbl>
+      <w:tblPr>
+        <w:tblStyle w:val="TableGrid"/>
+        <w:tblW w:type="auto" w:w="0"/>
+        <w:jc w:val="center"/>
+        <w:tblLayout w:type="autofit"/>
+        <w:tblLook w:firstColumn="1" w:firstRow="1" w:lastColumn="0" w:lastRow="0" w:noHBand="0" w:noVBand="1" w:val="04A0"/>
+      </w:tblPr>
+      <w:tblGrid>
+        <w:gridCol w:w="4536"/>
+        <w:gridCol w:w="4536"/>
+      </w:tblGrid>
+      <w:tr>
+        <w:trPr>
+          <w:cantSplit/>
+          <w:tblHeader w:val="true"/>
+        </w:trPr>
+        <w:tc>
+          <w:tcPr>
+            <w:tcW w:type="dxa" w:w="4536"/>
+            <w:vAlign w:val="center"/>
+            <w:tcMar>
+              <w:top w:w="80" w:type="dxa"/>
+              <w:start w:w="80" w:type="dxa"/>
+              <w:bottom w:w="80" w:type="dxa"/>
+              <w:end w:w="80" w:type="dxa"/>
+            </w:tcMar>
+            <w:shd w:fill="E7E6E3"/>
+          </w:tcPr>
+          <w:p>
+            <w:pPr>
+              <w:jc w:val="center"/>
+            </w:pPr>
+            <w:r>
+              <w:rPr>
+                <w:b/>
+              </w:rPr>
+            </w:r>
+            <w:r>
+              <w:rPr>
+                <w:rFonts w:ascii="Times New Roman" w:hAnsi="Times New Roman" w:cs="Times New Roman" w:eastAsia="宋体"/>
+                <w:b/>
+                <w:sz w:val="21"/>
+              </w:rPr>
+              <w:t>检查项</w:t>
+            </w:r>
+          </w:p>
+        </w:tc>
+        <w:tc>
+          <w:tcPr>
+            <w:tcW w:type="dxa" w:w="4536"/>
+            <w:vAlign w:val="center"/>
+            <w:tcMar>
+              <w:top w:w="80" w:type="dxa"/>
+              <w:start w:w="80" w:type="dxa"/>
+              <w:bottom w:w="80" w:type="dxa"/>
+              <w:end w:w="80" w:type="dxa"/>
+            </w:tcMar>
+            <w:shd w:fill="E7E6E3"/>
+          </w:tcPr>
+          <w:p>
+            <w:pPr>
+              <w:jc w:val="center"/>
+            </w:pPr>
+            <w:r>
+              <w:rPr>
+                <w:b/>
+              </w:rPr>
+            </w:r>
+            <w:r>
+              <w:rPr>
+                <w:rFonts w:ascii="Times New Roman" w:hAnsi="Times New Roman" w:cs="Times New Roman" w:eastAsia="宋体"/>
+                <w:b/>
+                <w:sz w:val="21"/>
+              </w:rPr>
+              <w:t>正式门槛</w:t>
+            </w:r>
+          </w:p>
+        </w:tc>
+      </w:tr>
+      <w:tr>
+        <w:trPr>
+          <w:cantSplit/>
+        </w:trPr>
+        <w:tc>
+          <w:tcPr>
+            <w:tcW w:type="dxa" w:w="4536"/>
+            <w:vAlign w:val="center"/>
+            <w:tcMar>
+              <w:top w:w="80" w:type="dxa"/>
+              <w:start w:w="80" w:type="dxa"/>
+              <w:bottom w:w="80" w:type="dxa"/>
+              <w:end w:w="80" w:type="dxa"/>
+            </w:tcMar>
+          </w:tcPr>
+          <w:p>
+            <w:pPr>
+              <w:jc w:val="center"/>
+            </w:pPr>
+            <w:r/>
+            <w:r>
+              <w:rPr>
+                <w:rFonts w:ascii="Times New Roman" w:hAnsi="Times New Roman" w:cs="Times New Roman" w:eastAsia="宋体"/>
+                <w:sz w:val="21"/>
+              </w:rPr>
+              <w:t>Sentinel-2 每季度有效像素比例</w:t>
+            </w:r>
+          </w:p>
+        </w:tc>
+        <w:tc>
+          <w:tcPr>
+            <w:tcW w:type="dxa" w:w="4536"/>
+            <w:vAlign w:val="center"/>
+            <w:tcMar>
+              <w:top w:w="80" w:type="dxa"/>
+              <w:start w:w="80" w:type="dxa"/>
+              <w:bottom w:w="80" w:type="dxa"/>
+              <w:end w:w="80" w:type="dxa"/>
+            </w:tcMar>
+          </w:tcPr>
+          <w:p>
+            <w:pPr>
+              <w:jc w:val="center"/>
+            </w:pPr>
+            <w:r/>
+            <w:r>
+              <w:rPr>
+                <w:rFonts w:ascii="Times New Roman" w:hAnsi="Times New Roman" w:cs="Times New Roman" w:eastAsia="宋体"/>
+                <w:sz w:val="21"/>
+              </w:rPr>
+              <w:t>不低于 60%</w:t>
+            </w:r>
+          </w:p>
+        </w:tc>
+      </w:tr>
+      <w:tr>
+        <w:trPr>
+          <w:cantSplit/>
+        </w:trPr>
+        <w:tc>
+          <w:tcPr>
+            <w:tcW w:type="dxa" w:w="4536"/>
+            <w:vAlign w:val="center"/>
+            <w:tcMar>
+              <w:top w:w="80" w:type="dxa"/>
+              <w:start w:w="80" w:type="dxa"/>
+              <w:bottom w:w="80" w:type="dxa"/>
+              <w:end w:w="80" w:type="dxa"/>
+            </w:tcMar>
+          </w:tcPr>
+          <w:p>
+            <w:pPr>
+              <w:jc w:val="center"/>
+            </w:pPr>
+            <w:r/>
+            <w:r>
+              <w:rPr>
+                <w:rFonts w:ascii="Times New Roman" w:hAnsi="Times New Roman" w:cs="Times New Roman" w:eastAsia="宋体"/>
+                <w:sz w:val="21"/>
+              </w:rPr>
+              <w:t>Sentinel-2 每季度有效观测数</w:t>
+            </w:r>
+          </w:p>
+        </w:tc>
+        <w:tc>
+          <w:tcPr>
+            <w:tcW w:type="dxa" w:w="4536"/>
+            <w:vAlign w:val="center"/>
+            <w:tcMar>
+              <w:top w:w="80" w:type="dxa"/>
+              <w:start w:w="80" w:type="dxa"/>
+              <w:bottom w:w="80" w:type="dxa"/>
+              <w:end w:w="80" w:type="dxa"/>
+            </w:tcMar>
+          </w:tcPr>
+          <w:p>
+            <w:pPr>
+              <w:jc w:val="center"/>
+            </w:pPr>
+            <w:r/>
+            <w:r>
+              <w:rPr>
+                <w:rFonts w:ascii="Times New Roman" w:hAnsi="Times New Roman" w:cs="Times New Roman" w:eastAsia="宋体"/>
+                <w:sz w:val="21"/>
+              </w:rPr>
+              <w:t>不少于 2 景</w:t>
+            </w:r>
+          </w:p>
+        </w:tc>
+      </w:tr>
+      <w:tr>
+        <w:trPr>
+          <w:cantSplit/>
+        </w:trPr>
+        <w:tc>
+          <w:tcPr>
+            <w:tcW w:type="dxa" w:w="4536"/>
+            <w:vAlign w:val="center"/>
+            <w:tcMar>
+              <w:top w:w="80" w:type="dxa"/>
+              <w:start w:w="80" w:type="dxa"/>
+              <w:bottom w:w="80" w:type="dxa"/>
+              <w:end w:w="80" w:type="dxa"/>
+            </w:tcMar>
+          </w:tcPr>
+          <w:p>
+            <w:pPr>
+              <w:jc w:val="center"/>
+            </w:pPr>
+            <w:r/>
+            <w:r>
+              <w:rPr>
+                <w:rFonts w:ascii="Times New Roman" w:hAnsi="Times New Roman" w:cs="Times New Roman" w:eastAsia="宋体"/>
+                <w:sz w:val="21"/>
+              </w:rPr>
+              <w:t>Landsat-8 每季度有效像素比例</w:t>
+            </w:r>
+          </w:p>
+        </w:tc>
+        <w:tc>
+          <w:tcPr>
+            <w:tcW w:type="dxa" w:w="4536"/>
+            <w:vAlign w:val="center"/>
+            <w:tcMar>
+              <w:top w:w="80" w:type="dxa"/>
+              <w:start w:w="80" w:type="dxa"/>
+              <w:bottom w:w="80" w:type="dxa"/>
+              <w:end w:w="80" w:type="dxa"/>
+            </w:tcMar>
+          </w:tcPr>
+          <w:p>
+            <w:pPr>
+              <w:jc w:val="center"/>
+            </w:pPr>
+            <w:r/>
+            <w:r>
+              <w:rPr>
+                <w:rFonts w:ascii="Times New Roman" w:hAnsi="Times New Roman" w:cs="Times New Roman" w:eastAsia="宋体"/>
+                <w:sz w:val="21"/>
+              </w:rPr>
+              <w:t>不低于 50%</w:t>
+            </w:r>
+          </w:p>
+        </w:tc>
+      </w:tr>
+      <w:tr>
+        <w:trPr>
+          <w:cantSplit/>
+        </w:trPr>
+        <w:tc>
+          <w:tcPr>
+            <w:tcW w:type="dxa" w:w="4536"/>
+            <w:vAlign w:val="center"/>
+            <w:tcMar>
+              <w:top w:w="80" w:type="dxa"/>
+              <w:start w:w="80" w:type="dxa"/>
+              <w:bottom w:w="80" w:type="dxa"/>
+              <w:end w:w="80" w:type="dxa"/>
+            </w:tcMar>
+          </w:tcPr>
+          <w:p>
+            <w:pPr>
+              <w:jc w:val="center"/>
+            </w:pPr>
+            <w:r/>
+            <w:r>
+              <w:rPr>
+                <w:rFonts w:ascii="Times New Roman" w:hAnsi="Times New Roman" w:cs="Times New Roman" w:eastAsia="宋体"/>
+                <w:sz w:val="21"/>
+              </w:rPr>
+              <w:t>Landsat-8 每季度有效观测数</w:t>
+            </w:r>
+          </w:p>
+        </w:tc>
+        <w:tc>
+          <w:tcPr>
+            <w:tcW w:type="dxa" w:w="4536"/>
+            <w:vAlign w:val="center"/>
+            <w:tcMar>
+              <w:top w:w="80" w:type="dxa"/>
+              <w:start w:w="80" w:type="dxa"/>
+              <w:bottom w:w="80" w:type="dxa"/>
+              <w:end w:w="80" w:type="dxa"/>
+            </w:tcMar>
+          </w:tcPr>
+          <w:p>
+            <w:pPr>
+              <w:jc w:val="center"/>
+            </w:pPr>
+            <w:r/>
+            <w:r>
+              <w:rPr>
+                <w:rFonts w:ascii="Times New Roman" w:hAnsi="Times New Roman" w:cs="Times New Roman" w:eastAsia="宋体"/>
+                <w:sz w:val="21"/>
+              </w:rPr>
+              <w:t>不少于 1 景</w:t>
+            </w:r>
+          </w:p>
+        </w:tc>
+      </w:tr>
+      <w:tr>
+        <w:trPr>
+          <w:cantSplit/>
+        </w:trPr>
+        <w:tc>
+          <w:tcPr>
+            <w:tcW w:type="dxa" w:w="4536"/>
+            <w:vAlign w:val="center"/>
+            <w:tcMar>
+              <w:top w:w="80" w:type="dxa"/>
+              <w:start w:w="80" w:type="dxa"/>
+              <w:bottom w:w="80" w:type="dxa"/>
+              <w:end w:w="80" w:type="dxa"/>
+            </w:tcMar>
+          </w:tcPr>
+          <w:p>
+            <w:pPr>
+              <w:jc w:val="center"/>
+            </w:pPr>
+            <w:r/>
+            <w:r>
+              <w:rPr>
+                <w:rFonts w:ascii="Times New Roman" w:hAnsi="Times New Roman" w:cs="Times New Roman" w:eastAsia="宋体"/>
+                <w:sz w:val="21"/>
+              </w:rPr>
+              <w:t>Sentinel-1 每季度空间覆盖</w:t>
+            </w:r>
+          </w:p>
+        </w:tc>
+        <w:tc>
+          <w:tcPr>
+            <w:tcW w:type="dxa" w:w="4536"/>
+            <w:vAlign w:val="center"/>
+            <w:tcMar>
+              <w:top w:w="80" w:type="dxa"/>
+              <w:start w:w="80" w:type="dxa"/>
+              <w:bottom w:w="80" w:type="dxa"/>
+              <w:end w:w="80" w:type="dxa"/>
+            </w:tcMar>
+          </w:tcPr>
+          <w:p>
+            <w:pPr>
+              <w:jc w:val="center"/>
+            </w:pPr>
+            <w:r/>
+            <w:r>
+              <w:rPr>
+                <w:rFonts w:ascii="Times New Roman" w:hAnsi="Times New Roman" w:cs="Times New Roman" w:eastAsia="宋体"/>
+                <w:sz w:val="21"/>
+              </w:rPr>
+              <w:t>不低于 90%</w:t>
+            </w:r>
+          </w:p>
+        </w:tc>
+      </w:tr>
+      <w:tr>
+        <w:trPr>
+          <w:cantSplit/>
+        </w:trPr>
+        <w:tc>
+          <w:tcPr>
+            <w:tcW w:type="dxa" w:w="4536"/>
+            <w:vAlign w:val="center"/>
+            <w:tcMar>
+              <w:top w:w="80" w:type="dxa"/>
+              <w:start w:w="80" w:type="dxa"/>
+              <w:bottom w:w="80" w:type="dxa"/>
+              <w:end w:w="80" w:type="dxa"/>
+            </w:tcMar>
+          </w:tcPr>
+          <w:p>
+            <w:pPr>
+              <w:jc w:val="center"/>
+            </w:pPr>
+            <w:r/>
+            <w:r>
+              <w:rPr>
+                <w:rFonts w:ascii="Times New Roman" w:hAnsi="Times New Roman" w:cs="Times New Roman" w:eastAsia="宋体"/>
+                <w:sz w:val="21"/>
+              </w:rPr>
+              <w:t>Sentinel-1 每季度获取次数</w:t>
+            </w:r>
+          </w:p>
+        </w:tc>
+        <w:tc>
+          <w:tcPr>
+            <w:tcW w:type="dxa" w:w="4536"/>
+            <w:vAlign w:val="center"/>
+            <w:tcMar>
+              <w:top w:w="80" w:type="dxa"/>
+              <w:start w:w="80" w:type="dxa"/>
+              <w:bottom w:w="80" w:type="dxa"/>
+              <w:end w:w="80" w:type="dxa"/>
+            </w:tcMar>
+          </w:tcPr>
+          <w:p>
+            <w:pPr>
+              <w:jc w:val="center"/>
+            </w:pPr>
+            <w:r/>
+            <w:r>
+              <w:rPr>
+                <w:rFonts w:ascii="Times New Roman" w:hAnsi="Times New Roman" w:cs="Times New Roman" w:eastAsia="宋体"/>
+                <w:sz w:val="21"/>
+              </w:rPr>
+              <w:t>不少于 2 次</w:t>
+            </w:r>
+          </w:p>
+        </w:tc>
+      </w:tr>
+      <w:tr>
+        <w:trPr>
+          <w:cantSplit/>
+        </w:trPr>
+        <w:tc>
+          <w:tcPr>
+            <w:tcW w:type="dxa" w:w="4536"/>
+            <w:vAlign w:val="center"/>
+            <w:tcMar>
+              <w:top w:w="80" w:type="dxa"/>
+              <w:start w:w="80" w:type="dxa"/>
+              <w:bottom w:w="80" w:type="dxa"/>
+              <w:end w:w="80" w:type="dxa"/>
+            </w:tcMar>
+          </w:tcPr>
+          <w:p>
+            <w:pPr>
+              <w:jc w:val="center"/>
+            </w:pPr>
+            <w:r/>
+            <w:r>
+              <w:rPr>
+                <w:rFonts w:ascii="Times New Roman" w:hAnsi="Times New Roman" w:cs="Times New Roman" w:eastAsia="宋体"/>
+                <w:sz w:val="21"/>
+              </w:rPr>
+              <w:t>每季度通过的模态</w:t>
+            </w:r>
+          </w:p>
+        </w:tc>
+        <w:tc>
+          <w:tcPr>
+            <w:tcW w:type="dxa" w:w="4536"/>
+            <w:vAlign w:val="center"/>
+            <w:tcMar>
+              <w:top w:w="80" w:type="dxa"/>
+              <w:start w:w="80" w:type="dxa"/>
+              <w:bottom w:w="80" w:type="dxa"/>
+              <w:end w:w="80" w:type="dxa"/>
+            </w:tcMar>
+          </w:tcPr>
+          <w:p>
+            <w:pPr>
+              <w:jc w:val="center"/>
+            </w:pPr>
+            <w:r/>
+            <w:r>
+              <w:rPr>
+                <w:rFonts w:ascii="Times New Roman" w:hAnsi="Times New Roman" w:cs="Times New Roman" w:eastAsia="宋体"/>
+                <w:sz w:val="21"/>
+              </w:rPr>
+              <w:t>不少于 2 个，其中至少 1 个光学</w:t>
+            </w:r>
+          </w:p>
+        </w:tc>
+      </w:tr>
+      <w:tr>
+        <w:trPr>
+          <w:cantSplit/>
+        </w:trPr>
+        <w:tc>
+          <w:tcPr>
+            <w:tcW w:type="dxa" w:w="4536"/>
+            <w:vAlign w:val="center"/>
+            <w:tcMar>
+              <w:top w:w="80" w:type="dxa"/>
+              <w:start w:w="80" w:type="dxa"/>
+              <w:bottom w:w="80" w:type="dxa"/>
+              <w:end w:w="80" w:type="dxa"/>
+            </w:tcMar>
+          </w:tcPr>
+          <w:p>
+            <w:pPr>
+              <w:jc w:val="center"/>
+            </w:pPr>
+            <w:r/>
+            <w:r>
+              <w:rPr>
+                <w:rFonts w:ascii="Times New Roman" w:hAnsi="Times New Roman" w:cs="Times New Roman" w:eastAsia="宋体"/>
+                <w:sz w:val="21"/>
+              </w:rPr>
+              <w:t>稳定目标配准误差中位数</w:t>
+            </w:r>
+          </w:p>
+        </w:tc>
+        <w:tc>
+          <w:tcPr>
+            <w:tcW w:type="dxa" w:w="4536"/>
+            <w:vAlign w:val="center"/>
+            <w:tcMar>
+              <w:top w:w="80" w:type="dxa"/>
+              <w:start w:w="80" w:type="dxa"/>
+              <w:bottom w:w="80" w:type="dxa"/>
+              <w:end w:w="80" w:type="dxa"/>
+            </w:tcMar>
+          </w:tcPr>
+          <w:p>
+            <w:pPr>
+              <w:jc w:val="center"/>
+            </w:pPr>
+            <w:r/>
+            <w:r>
+              <w:rPr>
+                <w:rFonts w:ascii="Times New Roman" w:hAnsi="Times New Roman" w:cs="Times New Roman" w:eastAsia="宋体"/>
+                <w:sz w:val="21"/>
+              </w:rPr>
+              <w:t>不超过 0.5 个 10 米像素</w:t>
+            </w:r>
+          </w:p>
+        </w:tc>
+      </w:tr>
+      <w:tr>
+        <w:trPr>
+          <w:cantSplit/>
+        </w:trPr>
+        <w:tc>
+          <w:tcPr>
+            <w:tcW w:type="dxa" w:w="4536"/>
+            <w:vAlign w:val="center"/>
+            <w:tcMar>
+              <w:top w:w="80" w:type="dxa"/>
+              <w:start w:w="80" w:type="dxa"/>
+              <w:bottom w:w="80" w:type="dxa"/>
+              <w:end w:w="80" w:type="dxa"/>
+            </w:tcMar>
+          </w:tcPr>
+          <w:p>
+            <w:pPr>
+              <w:jc w:val="center"/>
+            </w:pPr>
+            <w:r/>
+            <w:r>
+              <w:rPr>
+                <w:rFonts w:ascii="Times New Roman" w:hAnsi="Times New Roman" w:cs="Times New Roman" w:eastAsia="宋体"/>
+                <w:sz w:val="21"/>
+              </w:rPr>
+              <w:t>稳定目标配准误差 P95</w:t>
+            </w:r>
+          </w:p>
+        </w:tc>
+        <w:tc>
+          <w:tcPr>
+            <w:tcW w:type="dxa" w:w="4536"/>
+            <w:vAlign w:val="center"/>
+            <w:tcMar>
+              <w:top w:w="80" w:type="dxa"/>
+              <w:start w:w="80" w:type="dxa"/>
+              <w:bottom w:w="80" w:type="dxa"/>
+              <w:end w:w="80" w:type="dxa"/>
+            </w:tcMar>
+          </w:tcPr>
+          <w:p>
+            <w:pPr>
+              <w:jc w:val="center"/>
+            </w:pPr>
+            <w:r/>
+            <w:r>
+              <w:rPr>
+                <w:rFonts w:ascii="Times New Roman" w:hAnsi="Times New Roman" w:cs="Times New Roman" w:eastAsia="宋体"/>
+                <w:sz w:val="21"/>
+              </w:rPr>
+              <w:t>不超过 1.0 个 10 米像素</w:t>
+            </w:r>
+          </w:p>
+        </w:tc>
+      </w:tr>
+    </w:tbl>
     <w:p>
       <w:r>
         <w:rPr>
           <w:rFonts w:ascii="Times New Roman" w:hAnsi="Times New Roman" w:cs="Times New Roman" w:eastAsia="宋体"/>
           <w:sz w:val="24"/>
         </w:rPr>
-        <w:t xml:space="preserve">缺失某个可选模态时，保存 </w:t>
-      </w:r>
-      <w:r>
-        <w:rPr>
-          <w:rFonts w:ascii="Times New Roman" w:hAnsi="Times New Roman" w:cs="Times New Roman" w:eastAsia="宋体"/>
-          <w:sz w:val="24"/>
-        </w:rPr>
-        <w:t>valid_mask=0</w:t>
-      </w:r>
-      <w:r>
-        <w:rPr>
-          <w:rFonts w:ascii="Times New Roman" w:hAnsi="Times New Roman" w:cs="Times New Roman" w:eastAsia="宋体"/>
-          <w:sz w:val="24"/>
-        </w:rPr>
-        <w:t>，该模态不计算重建损失。缺少核心 数据或某季度有效像素不足时，样本进入补片队列，记录 patch、季度、数据源和 失败原因。补片必须从同一空间位置寻找其他日期影像；只有确认该位置无法获取 合格数据后，才允许按预先冻结的替补规则更换空间样本。</w:t>
+        <w:t>Sentinel-1 固定为 RTC、IW、VV/VH，冻结轨向策略、DEM、单位和处理版本。 阈值需要在 2,000 点试运行后复核；任何调整都升级策略版本并重跑全量审计。</w:t>
       </w:r>
     </w:p>
     <w:p>
@@ -2980,7 +4296,179 @@
           <w:b/>
           <w:sz w:val="24"/>
         </w:rPr>
-        <w:t>4. 配准检查</w:t>
+        <w:t>4. 缺失数据处理</w:t>
+      </w:r>
+    </w:p>
+    <w:p>
+      <w:r>
+        <w:rPr>
+          <w:rFonts w:ascii="Times New Roman" w:hAnsi="Times New Roman" w:cs="Times New Roman" w:eastAsia="宋体"/>
+          <w:sz w:val="24"/>
+        </w:rPr>
+        <w:t xml:space="preserve">某季度达到全部门槛记为 </w:t>
+      </w:r>
+      <w:r>
+        <w:rPr>
+          <w:rFonts w:ascii="Times New Roman" w:hAnsi="Times New Roman" w:cs="Times New Roman" w:eastAsia="宋体"/>
+          <w:sz w:val="24"/>
+        </w:rPr>
+        <w:t>accepted</w:t>
+      </w:r>
+      <w:r>
+        <w:rPr>
+          <w:rFonts w:ascii="Times New Roman" w:hAnsi="Times New Roman" w:cs="Times New Roman" w:eastAsia="宋体"/>
+          <w:sz w:val="24"/>
+        </w:rPr>
+        <w:t xml:space="preserve">；至少一个光学源和另一个模态通过时记为 </w:t>
+      </w:r>
+      <w:r>
+        <w:rPr>
+          <w:rFonts w:ascii="Times New Roman" w:hAnsi="Times New Roman" w:cs="Times New Roman" w:eastAsia="宋体"/>
+          <w:sz w:val="24"/>
+        </w:rPr>
+        <w:t>partial</w:t>
+      </w:r>
+      <w:r>
+        <w:rPr>
+          <w:rFonts w:ascii="Times New Roman" w:hAnsi="Times New Roman" w:cs="Times New Roman" w:eastAsia="宋体"/>
+          <w:sz w:val="24"/>
+        </w:rPr>
+        <w:t xml:space="preserve">，缺失目标不计算损失；其余或配准失败记为 </w:t>
+      </w:r>
+      <w:r>
+        <w:rPr>
+          <w:rFonts w:ascii="Times New Roman" w:hAnsi="Times New Roman" w:cs="Times New Roman" w:eastAsia="宋体"/>
+          <w:sz w:val="24"/>
+        </w:rPr>
+        <w:t>quarantined</w:t>
+      </w:r>
+      <w:r>
+        <w:rPr>
+          <w:rFonts w:ascii="Times New Roman" w:hAnsi="Times New Roman" w:cs="Times New Roman" w:eastAsia="宋体"/>
+          <w:sz w:val="24"/>
+        </w:rPr>
+        <w:t xml:space="preserve">。问题样本 进入“影像数据修复队列”，记录 patch、季度、数据源和失败原因。 </w:t>
+      </w:r>
+      <w:r>
+        <w:rPr>
+          <w:rFonts w:ascii="Times New Roman" w:hAnsi="Times New Roman" w:cs="Times New Roman" w:eastAsia="宋体"/>
+          <w:sz w:val="24"/>
+        </w:rPr>
+        <w:t>accepted</w:t>
+      </w:r>
+      <w:r>
+        <w:rPr>
+          <w:rFonts w:ascii="Times New Roman" w:hAnsi="Times New Roman" w:cs="Times New Roman" w:eastAsia="宋体"/>
+          <w:sz w:val="24"/>
+        </w:rPr>
+        <w:t xml:space="preserve"> 和 </w:t>
+      </w:r>
+      <w:r>
+        <w:rPr>
+          <w:rFonts w:ascii="Times New Roman" w:hAnsi="Times New Roman" w:cs="Times New Roman" w:eastAsia="宋体"/>
+          <w:sz w:val="24"/>
+        </w:rPr>
+        <w:t>partial</w:t>
+      </w:r>
+      <w:r>
+        <w:rPr>
+          <w:rFonts w:ascii="Times New Roman" w:hAnsi="Times New Roman" w:cs="Times New Roman" w:eastAsia="宋体"/>
+          <w:sz w:val="24"/>
+        </w:rPr>
+        <w:t xml:space="preserve"> 可以训练，但每个季度 </w:t>
+      </w:r>
+      <w:r>
+        <w:rPr>
+          <w:rFonts w:ascii="Times New Roman" w:hAnsi="Times New Roman" w:cs="Times New Roman" w:eastAsia="宋体"/>
+          <w:sz w:val="24"/>
+        </w:rPr>
+        <w:t>partial</w:t>
+      </w:r>
+      <w:r>
+        <w:rPr>
+          <w:rFonts w:ascii="Times New Roman" w:hAnsi="Times New Roman" w:cs="Times New Roman" w:eastAsia="宋体"/>
+          <w:sz w:val="24"/>
+        </w:rPr>
+        <w:t xml:space="preserve"> 占比不超过 25%； </w:t>
+      </w:r>
+      <w:r>
+        <w:rPr>
+          <w:rFonts w:ascii="Times New Roman" w:hAnsi="Times New Roman" w:cs="Times New Roman" w:eastAsia="宋体"/>
+          <w:sz w:val="24"/>
+        </w:rPr>
+        <w:t>quarantined</w:t>
+      </w:r>
+      <w:r>
+        <w:rPr>
+          <w:rFonts w:ascii="Times New Roman" w:hAnsi="Times New Roman" w:cs="Times New Roman" w:eastAsia="宋体"/>
+          <w:sz w:val="24"/>
+        </w:rPr>
+        <w:t xml:space="preserve"> 不进入训练。</w:t>
+      </w:r>
+    </w:p>
+    <w:p>
+      <w:r>
+        <w:rPr>
+          <w:rFonts w:ascii="Times New Roman" w:hAnsi="Times New Roman" w:cs="Times New Roman" w:eastAsia="宋体"/>
+          <w:sz w:val="24"/>
+        </w:rPr>
+        <w:t xml:space="preserve">正式选择前，每层按不少于主配额 10% 冻结有序候补池。只有最终注册表冻结前 可以替换，替补必须匹配采样层、UTM 分区、省域和生态区，并留下版本记录。最终 62,000 点中的每个位置必须在八个季度均为 </w:t>
+      </w:r>
+      <w:r>
+        <w:rPr>
+          <w:rFonts w:ascii="Times New Roman" w:hAnsi="Times New Roman" w:cs="Times New Roman" w:eastAsia="宋体"/>
+          <w:sz w:val="24"/>
+        </w:rPr>
+        <w:t>accepted</w:t>
+      </w:r>
+      <w:r>
+        <w:rPr>
+          <w:rFonts w:ascii="Times New Roman" w:hAnsi="Times New Roman" w:cs="Times New Roman" w:eastAsia="宋体"/>
+          <w:sz w:val="24"/>
+        </w:rPr>
+        <w:t xml:space="preserve"> 或 </w:t>
+      </w:r>
+      <w:r>
+        <w:rPr>
+          <w:rFonts w:ascii="Times New Roman" w:hAnsi="Times New Roman" w:cs="Times New Roman" w:eastAsia="宋体"/>
+          <w:sz w:val="24"/>
+        </w:rPr>
+        <w:t>partial</w:t>
+      </w:r>
+      <w:r>
+        <w:rPr>
+          <w:rFonts w:ascii="Times New Roman" w:hAnsi="Times New Roman" w:cs="Times New Roman" w:eastAsia="宋体"/>
+          <w:sz w:val="24"/>
+        </w:rPr>
+        <w:t xml:space="preserve">；存在任一 </w:t>
+      </w:r>
+      <w:r>
+        <w:rPr>
+          <w:rFonts w:ascii="Times New Roman" w:hAnsi="Times New Roman" w:cs="Times New Roman" w:eastAsia="宋体"/>
+          <w:sz w:val="24"/>
+        </w:rPr>
+        <w:t>quarantined</w:t>
+      </w:r>
+      <w:r>
+        <w:rPr>
+          <w:rFonts w:ascii="Times New Roman" w:hAnsi="Times New Roman" w:cs="Times New Roman" w:eastAsia="宋体"/>
+          <w:sz w:val="24"/>
+        </w:rPr>
+        <w:t xml:space="preserve"> 季度的主候选须在冻结前修复或用同层候补替换。注册表冻结后 不再换点，只修复同一位置的数据或显式标记缺测。</w:t>
+      </w:r>
+    </w:p>
+    <w:p>
+      <w:pPr>
+        <w:pStyle w:val="Heading2"/>
+        <w:jc w:val="left"/>
+      </w:pPr>
+      <w:r>
+        <w:rPr>
+          <w:rFonts w:ascii="Times New Roman" w:hAnsi="Times New Roman" w:cs="Times New Roman" w:eastAsia="宋体"/>
+          <w:b/>
+          <w:sz w:val="24"/>
+        </w:rPr>
+        <w:t>5. 配准检查</w:t>
       </w:r>
     </w:p>
     <w:p>
@@ -3012,7 +4500,7 @@
           <w:rFonts w:ascii="Times New Roman" w:hAnsi="Times New Roman" w:cs="Times New Roman" w:eastAsia="宋体"/>
           <w:sz w:val="24"/>
         </w:rPr>
-        <w:t>开发阶段采用空间分块的 90%/5%/5% 划分：</w:t>
+        <w:t>开发阶段在 EPSG:6933 上建立 50 km 父空间块，按父块执行目标为 90%/5%/5%的划分。不同集合之间设置 25.6 km 缓冲；同一位置的八个季度和 所有重叠 footprint 必须进入同一集合。比例允许上下浮动 1 个百分点：</w:t>
       </w:r>
     </w:p>
     <w:tbl>
@@ -3024,14 +4512,18 @@
         <w:tblLook w:firstColumn="1" w:firstRow="1" w:lastColumn="0" w:lastRow="0" w:noHBand="0" w:noVBand="1" w:val="04A0"/>
       </w:tblPr>
       <w:tblGrid>
-        <w:gridCol w:w="3135"/>
-        <w:gridCol w:w="3135"/>
-        <w:gridCol w:w="3135"/>
+        <w:gridCol w:w="3024"/>
+        <w:gridCol w:w="3024"/>
+        <w:gridCol w:w="3024"/>
       </w:tblGrid>
       <w:tr>
+        <w:trPr>
+          <w:cantSplit/>
+          <w:tblHeader w:val="true"/>
+        </w:trPr>
         <w:tc>
           <w:tcPr>
-            <w:tcW w:type="dxa" w:w="3135"/>
+            <w:tcW w:type="dxa" w:w="3024"/>
             <w:vAlign w:val="center"/>
             <w:tcMar>
               <w:top w:w="80" w:type="dxa"/>
@@ -3062,7 +4554,7 @@
         </w:tc>
         <w:tc>
           <w:tcPr>
-            <w:tcW w:type="dxa" w:w="3135"/>
+            <w:tcW w:type="dxa" w:w="3024"/>
             <w:vAlign w:val="center"/>
             <w:tcMar>
               <w:top w:w="80" w:type="dxa"/>
@@ -3093,7 +4585,7 @@
         </w:tc>
         <w:tc>
           <w:tcPr>
-            <w:tcW w:type="dxa" w:w="3135"/>
+            <w:tcW w:type="dxa" w:w="3024"/>
             <w:vAlign w:val="center"/>
             <w:tcMar>
               <w:top w:w="80" w:type="dxa"/>
@@ -3124,9 +4616,12 @@
         </w:tc>
       </w:tr>
       <w:tr>
+        <w:trPr>
+          <w:cantSplit/>
+        </w:trPr>
         <w:tc>
           <w:tcPr>
-            <w:tcW w:type="dxa" w:w="3135"/>
+            <w:tcW w:type="dxa" w:w="3024"/>
             <w:vAlign w:val="center"/>
             <w:tcMar>
               <w:top w:w="80" w:type="dxa"/>
@@ -3151,7 +4646,7 @@
         </w:tc>
         <w:tc>
           <w:tcPr>
-            <w:tcW w:type="dxa" w:w="3135"/>
+            <w:tcW w:type="dxa" w:w="3024"/>
             <w:vAlign w:val="center"/>
             <w:tcMar>
               <w:top w:w="80" w:type="dxa"/>
@@ -3170,13 +4665,13 @@
                 <w:rFonts w:ascii="Times New Roman" w:hAnsi="Times New Roman" w:cs="Times New Roman" w:eastAsia="宋体"/>
                 <w:sz w:val="21"/>
               </w:rPr>
-              <w:t>55,800</w:t>
+              <w:t>约 55,800</w:t>
             </w:r>
           </w:p>
         </w:tc>
         <w:tc>
           <w:tcPr>
-            <w:tcW w:type="dxa" w:w="3135"/>
+            <w:tcW w:type="dxa" w:w="3024"/>
             <w:vAlign w:val="center"/>
             <w:tcMar>
               <w:top w:w="80" w:type="dxa"/>
@@ -3201,9 +4696,12 @@
         </w:tc>
       </w:tr>
       <w:tr>
+        <w:trPr>
+          <w:cantSplit/>
+        </w:trPr>
         <w:tc>
           <w:tcPr>
-            <w:tcW w:type="dxa" w:w="3135"/>
+            <w:tcW w:type="dxa" w:w="3024"/>
             <w:vAlign w:val="center"/>
             <w:tcMar>
               <w:top w:w="80" w:type="dxa"/>
@@ -3228,7 +4726,7 @@
         </w:tc>
         <w:tc>
           <w:tcPr>
-            <w:tcW w:type="dxa" w:w="3135"/>
+            <w:tcW w:type="dxa" w:w="3024"/>
             <w:vAlign w:val="center"/>
             <w:tcMar>
               <w:top w:w="80" w:type="dxa"/>
@@ -3247,13 +4745,13 @@
                 <w:rFonts w:ascii="Times New Roman" w:hAnsi="Times New Roman" w:cs="Times New Roman" w:eastAsia="宋体"/>
                 <w:sz w:val="21"/>
               </w:rPr>
-              <w:t>3,100</w:t>
+              <w:t>约 3,100</w:t>
             </w:r>
           </w:p>
         </w:tc>
         <w:tc>
           <w:tcPr>
-            <w:tcW w:type="dxa" w:w="3135"/>
+            <w:tcW w:type="dxa" w:w="3024"/>
             <w:vAlign w:val="center"/>
             <w:tcMar>
               <w:top w:w="80" w:type="dxa"/>
@@ -3278,9 +4776,12 @@
         </w:tc>
       </w:tr>
       <w:tr>
+        <w:trPr>
+          <w:cantSplit/>
+        </w:trPr>
         <w:tc>
           <w:tcPr>
-            <w:tcW w:type="dxa" w:w="3135"/>
+            <w:tcW w:type="dxa" w:w="3024"/>
             <w:vAlign w:val="center"/>
             <w:tcMar>
               <w:top w:w="80" w:type="dxa"/>
@@ -3305,7 +4806,7 @@
         </w:tc>
         <w:tc>
           <w:tcPr>
-            <w:tcW w:type="dxa" w:w="3135"/>
+            <w:tcW w:type="dxa" w:w="3024"/>
             <w:vAlign w:val="center"/>
             <w:tcMar>
               <w:top w:w="80" w:type="dxa"/>
@@ -3324,13 +4825,13 @@
                 <w:rFonts w:ascii="Times New Roman" w:hAnsi="Times New Roman" w:cs="Times New Roman" w:eastAsia="宋体"/>
                 <w:sz w:val="21"/>
               </w:rPr>
-              <w:t>3,100</w:t>
+              <w:t>约 3,100</w:t>
             </w:r>
           </w:p>
         </w:tc>
         <w:tc>
           <w:tcPr>
-            <w:tcW w:type="dxa" w:w="3135"/>
+            <w:tcW w:type="dxa" w:w="3024"/>
             <w:vAlign w:val="center"/>
             <w:tcMar>
               <w:top w:w="80" w:type="dxa"/>
@@ -3370,7 +4871,7 @@
           <w:rFonts w:ascii="Times New Roman" w:hAnsi="Times New Roman" w:cs="Times New Roman" w:eastAsia="宋体"/>
           <w:sz w:val="24"/>
         </w:rPr>
-        <w:t>完成模型结构、损失权重和训练轮数选择后，可以使用全部 62,000 个 patch 进行 生产版最终训练。此时性能报告仍使用开发阶段已冻结的独立标签、外部区域或时间 留出数据，不能把全量训练后的模型再用原测试位置调参数。</w:t>
+        <w:t>内部测试标签在协议冻结前封存，训练过程中不得反复查看。完成模型结构、损失 权重和训练轮数选择后，可以使用全部 62,000 个 patch 进行 生产版最终训练。此时性能报告仍使用开发阶段已冻结的独立标签、外部区域或时间 留出数据，不能把全量训练后的模型再用原测试位置调参数。凡预训练影像覆盖了 测试位置的结果，明确标为 transductive；跨区域或跨时间完全留出结果才用于 inductive 泛化声明。</w:t>
       </w:r>
     </w:p>
     <w:p>
@@ -3405,13 +4906,17 @@
         <w:tblLook w:firstColumn="1" w:firstRow="1" w:lastColumn="0" w:lastRow="0" w:noHBand="0" w:noVBand="1" w:val="04A0"/>
       </w:tblPr>
       <w:tblGrid>
-        <w:gridCol w:w="4703"/>
-        <w:gridCol w:w="4703"/>
+        <w:gridCol w:w="4536"/>
+        <w:gridCol w:w="4536"/>
       </w:tblGrid>
       <w:tr>
+        <w:trPr>
+          <w:cantSplit/>
+          <w:tblHeader w:val="true"/>
+        </w:trPr>
         <w:tc>
           <w:tcPr>
-            <w:tcW w:type="dxa" w:w="4703"/>
+            <w:tcW w:type="dxa" w:w="4536"/>
             <w:vAlign w:val="center"/>
             <w:tcMar>
               <w:top w:w="80" w:type="dxa"/>
@@ -3442,7 +4947,7 @@
         </w:tc>
         <w:tc>
           <w:tcPr>
-            <w:tcW w:type="dxa" w:w="4703"/>
+            <w:tcW w:type="dxa" w:w="4536"/>
             <w:vAlign w:val="center"/>
             <w:tcMar>
               <w:top w:w="80" w:type="dxa"/>
@@ -3473,9 +4978,12 @@
         </w:tc>
       </w:tr>
       <w:tr>
+        <w:trPr>
+          <w:cantSplit/>
+        </w:trPr>
         <w:tc>
           <w:tcPr>
-            <w:tcW w:type="dxa" w:w="4703"/>
+            <w:tcW w:type="dxa" w:w="4536"/>
             <w:vAlign w:val="center"/>
             <w:tcMar>
               <w:top w:w="80" w:type="dxa"/>
@@ -3500,7 +5008,7 @@
         </w:tc>
         <w:tc>
           <w:tcPr>
-            <w:tcW w:type="dxa" w:w="4703"/>
+            <w:tcW w:type="dxa" w:w="4536"/>
             <w:vAlign w:val="center"/>
             <w:tcMar>
               <w:top w:w="80" w:type="dxa"/>
@@ -3525,9 +5033,12 @@
         </w:tc>
       </w:tr>
       <w:tr>
+        <w:trPr>
+          <w:cantSplit/>
+        </w:trPr>
         <w:tc>
           <w:tcPr>
-            <w:tcW w:type="dxa" w:w="4703"/>
+            <w:tcW w:type="dxa" w:w="4536"/>
             <w:vAlign w:val="center"/>
             <w:tcMar>
               <w:top w:w="80" w:type="dxa"/>
@@ -3546,13 +5057,13 @@
                 <w:rFonts w:ascii="Times New Roman" w:hAnsi="Times New Roman" w:cs="Times New Roman" w:eastAsia="宋体"/>
                 <w:sz w:val="21"/>
               </w:rPr>
-              <w:t>geometry_hash</w:t>
+              <w:t>identity_hash</w:t>
             </w:r>
           </w:p>
         </w:tc>
         <w:tc>
           <w:tcPr>
-            <w:tcW w:type="dxa" w:w="4703"/>
+            <w:tcW w:type="dxa" w:w="4536"/>
             <w:vAlign w:val="center"/>
             <w:tcMar>
               <w:top w:w="80" w:type="dxa"/>
@@ -3571,15 +5082,73 @@
                 <w:rFonts w:ascii="Times New Roman" w:hAnsi="Times New Roman" w:cs="Times New Roman" w:eastAsia="宋体"/>
                 <w:sz w:val="21"/>
               </w:rPr>
-              <w:t>空间几何校验值</w:t>
+              <w:t>CRS、网格版本、整数行列组成的身份校验值</w:t>
             </w:r>
           </w:p>
         </w:tc>
       </w:tr>
       <w:tr>
+        <w:trPr>
+          <w:cantSplit/>
+        </w:trPr>
         <w:tc>
           <w:tcPr>
-            <w:tcW w:type="dxa" w:w="4703"/>
+            <w:tcW w:type="dxa" w:w="4536"/>
+            <w:vAlign w:val="center"/>
+            <w:tcMar>
+              <w:top w:w="80" w:type="dxa"/>
+              <w:start w:w="80" w:type="dxa"/>
+              <w:bottom w:w="80" w:type="dxa"/>
+              <w:end w:w="80" w:type="dxa"/>
+            </w:tcMar>
+          </w:tcPr>
+          <w:p>
+            <w:pPr>
+              <w:jc w:val="center"/>
+            </w:pPr>
+            <w:r/>
+            <w:r>
+              <w:rPr>
+                <w:rFonts w:ascii="Times New Roman" w:hAnsi="Times New Roman" w:cs="Times New Roman" w:eastAsia="宋体"/>
+                <w:sz w:val="21"/>
+              </w:rPr>
+              <w:t>canonical_wgs84_footprint_hash</w:t>
+            </w:r>
+          </w:p>
+        </w:tc>
+        <w:tc>
+          <w:tcPr>
+            <w:tcW w:type="dxa" w:w="4536"/>
+            <w:vAlign w:val="center"/>
+            <w:tcMar>
+              <w:top w:w="80" w:type="dxa"/>
+              <w:start w:w="80" w:type="dxa"/>
+              <w:bottom w:w="80" w:type="dxa"/>
+              <w:end w:w="80" w:type="dxa"/>
+            </w:tcMar>
+          </w:tcPr>
+          <w:p>
+            <w:pPr>
+              <w:jc w:val="center"/>
+            </w:pPr>
+            <w:r/>
+            <w:r>
+              <w:rPr>
+                <w:rFonts w:ascii="Times New Roman" w:hAnsi="Times New Roman" w:cs="Times New Roman" w:eastAsia="宋体"/>
+                <w:sz w:val="21"/>
+              </w:rPr>
+              <w:t>规范化 WGS84 footprint 校验值</w:t>
+            </w:r>
+          </w:p>
+        </w:tc>
+      </w:tr>
+      <w:tr>
+        <w:trPr>
+          <w:cantSplit/>
+        </w:trPr>
+        <w:tc>
+          <w:tcPr>
+            <w:tcW w:type="dxa" w:w="4536"/>
             <w:vAlign w:val="center"/>
             <w:tcMar>
               <w:top w:w="80" w:type="dxa"/>
@@ -3604,7 +5173,7 @@
         </w:tc>
         <w:tc>
           <w:tcPr>
-            <w:tcW w:type="dxa" w:w="4703"/>
+            <w:tcW w:type="dxa" w:w="4536"/>
             <w:vAlign w:val="center"/>
             <w:tcMar>
               <w:top w:w="80" w:type="dxa"/>
@@ -3629,9 +5198,12 @@
         </w:tc>
       </w:tr>
       <w:tr>
+        <w:trPr>
+          <w:cantSplit/>
+        </w:trPr>
         <w:tc>
           <w:tcPr>
-            <w:tcW w:type="dxa" w:w="4703"/>
+            <w:tcW w:type="dxa" w:w="4536"/>
             <w:vAlign w:val="center"/>
             <w:tcMar>
               <w:top w:w="80" w:type="dxa"/>
@@ -3656,7 +5228,7 @@
         </w:tc>
         <w:tc>
           <w:tcPr>
-            <w:tcW w:type="dxa" w:w="4703"/>
+            <w:tcW w:type="dxa" w:w="4536"/>
             <w:vAlign w:val="center"/>
             <w:tcMar>
               <w:top w:w="80" w:type="dxa"/>
@@ -3681,9 +5253,12 @@
         </w:tc>
       </w:tr>
       <w:tr>
+        <w:trPr>
+          <w:cantSplit/>
+        </w:trPr>
         <w:tc>
           <w:tcPr>
-            <w:tcW w:type="dxa" w:w="4703"/>
+            <w:tcW w:type="dxa" w:w="4536"/>
             <w:vAlign w:val="center"/>
             <w:tcMar>
               <w:top w:w="80" w:type="dxa"/>
@@ -3708,7 +5283,7 @@
         </w:tc>
         <w:tc>
           <w:tcPr>
-            <w:tcW w:type="dxa" w:w="4703"/>
+            <w:tcW w:type="dxa" w:w="4536"/>
             <w:vAlign w:val="center"/>
             <w:tcMar>
               <w:top w:w="80" w:type="dxa"/>
@@ -3733,9 +5308,12 @@
         </w:tc>
       </w:tr>
       <w:tr>
+        <w:trPr>
+          <w:cantSplit/>
+        </w:trPr>
         <w:tc>
           <w:tcPr>
-            <w:tcW w:type="dxa" w:w="4703"/>
+            <w:tcW w:type="dxa" w:w="4536"/>
             <w:vAlign w:val="center"/>
             <w:tcMar>
               <w:top w:w="80" w:type="dxa"/>
@@ -3760,7 +5338,7 @@
         </w:tc>
         <w:tc>
           <w:tcPr>
-            <w:tcW w:type="dxa" w:w="4703"/>
+            <w:tcW w:type="dxa" w:w="4536"/>
             <w:vAlign w:val="center"/>
             <w:tcMar>
               <w:top w:w="80" w:type="dxa"/>
@@ -3785,9 +5363,12 @@
         </w:tc>
       </w:tr>
       <w:tr>
+        <w:trPr>
+          <w:cantSplit/>
+        </w:trPr>
         <w:tc>
           <w:tcPr>
-            <w:tcW w:type="dxa" w:w="4703"/>
+            <w:tcW w:type="dxa" w:w="4536"/>
             <w:vAlign w:val="center"/>
             <w:tcMar>
               <w:top w:w="80" w:type="dxa"/>
@@ -3812,7 +5393,7 @@
         </w:tc>
         <w:tc>
           <w:tcPr>
-            <w:tcW w:type="dxa" w:w="4703"/>
+            <w:tcW w:type="dxa" w:w="4536"/>
             <w:vAlign w:val="center"/>
             <w:tcMar>
               <w:top w:w="80" w:type="dxa"/>
@@ -3837,9 +5418,12 @@
         </w:tc>
       </w:tr>
       <w:tr>
+        <w:trPr>
+          <w:cantSplit/>
+        </w:trPr>
         <w:tc>
           <w:tcPr>
-            <w:tcW w:type="dxa" w:w="4703"/>
+            <w:tcW w:type="dxa" w:w="4536"/>
             <w:vAlign w:val="center"/>
             <w:tcMar>
               <w:top w:w="80" w:type="dxa"/>
@@ -3864,7 +5448,7 @@
         </w:tc>
         <w:tc>
           <w:tcPr>
-            <w:tcW w:type="dxa" w:w="4703"/>
+            <w:tcW w:type="dxa" w:w="4536"/>
             <w:vAlign w:val="center"/>
             <w:tcMar>
               <w:top w:w="80" w:type="dxa"/>
@@ -3889,9 +5473,12 @@
         </w:tc>
       </w:tr>
       <w:tr>
+        <w:trPr>
+          <w:cantSplit/>
+        </w:trPr>
         <w:tc>
           <w:tcPr>
-            <w:tcW w:type="dxa" w:w="4703"/>
+            <w:tcW w:type="dxa" w:w="4536"/>
             <w:vAlign w:val="center"/>
             <w:tcMar>
               <w:top w:w="80" w:type="dxa"/>
@@ -3916,7 +5503,7 @@
         </w:tc>
         <w:tc>
           <w:tcPr>
-            <w:tcW w:type="dxa" w:w="4703"/>
+            <w:tcW w:type="dxa" w:w="4536"/>
             <w:vAlign w:val="center"/>
             <w:tcMar>
               <w:top w:w="80" w:type="dxa"/>
@@ -3941,9 +5528,12 @@
         </w:tc>
       </w:tr>
       <w:tr>
+        <w:trPr>
+          <w:cantSplit/>
+        </w:trPr>
         <w:tc>
           <w:tcPr>
-            <w:tcW w:type="dxa" w:w="4703"/>
+            <w:tcW w:type="dxa" w:w="4536"/>
             <w:vAlign w:val="center"/>
             <w:tcMar>
               <w:top w:w="80" w:type="dxa"/>
@@ -3968,7 +5558,7 @@
         </w:tc>
         <w:tc>
           <w:tcPr>
-            <w:tcW w:type="dxa" w:w="4703"/>
+            <w:tcW w:type="dxa" w:w="4536"/>
             <w:vAlign w:val="center"/>
             <w:tcMar>
               <w:top w:w="80" w:type="dxa"/>
@@ -3993,9 +5583,177 @@
         </w:tc>
       </w:tr>
       <w:tr>
+        <w:trPr>
+          <w:cantSplit/>
+        </w:trPr>
         <w:tc>
           <w:tcPr>
-            <w:tcW w:type="dxa" w:w="4703"/>
+            <w:tcW w:type="dxa" w:w="4536"/>
+            <w:vAlign w:val="center"/>
+            <w:tcMar>
+              <w:top w:w="80" w:type="dxa"/>
+              <w:start w:w="80" w:type="dxa"/>
+              <w:bottom w:w="80" w:type="dxa"/>
+              <w:end w:w="80" w:type="dxa"/>
+            </w:tcMar>
+          </w:tcPr>
+          <w:p>
+            <w:pPr>
+              <w:jc w:val="center"/>
+            </w:pPr>
+            <w:r/>
+            <w:r>
+              <w:rPr>
+                <w:rFonts w:ascii="Times New Roman" w:hAnsi="Times New Roman" w:cs="Times New Roman" w:eastAsia="宋体"/>
+                <w:sz w:val="21"/>
+              </w:rPr>
+              <w:t>sampling_design_type</w:t>
+            </w:r>
+          </w:p>
+        </w:tc>
+        <w:tc>
+          <w:tcPr>
+            <w:tcW w:type="dxa" w:w="4536"/>
+            <w:vAlign w:val="center"/>
+            <w:tcMar>
+              <w:top w:w="80" w:type="dxa"/>
+              <w:start w:w="80" w:type="dxa"/>
+              <w:bottom w:w="80" w:type="dxa"/>
+              <w:end w:w="80" w:type="dxa"/>
+            </w:tcMar>
+          </w:tcPr>
+          <w:p>
+            <w:pPr>
+              <w:jc w:val="center"/>
+            </w:pPr>
+            <w:r/>
+            <w:r>
+              <w:rPr>
+                <w:rFonts w:ascii="Times New Roman" w:hAnsi="Times New Roman" w:cs="Times New Roman" w:eastAsia="宋体"/>
+                <w:sz w:val="21"/>
+              </w:rPr>
+              <w:t>probability_base 或 non_probability_targeted_sample</w:t>
+            </w:r>
+          </w:p>
+        </w:tc>
+      </w:tr>
+      <w:tr>
+        <w:trPr>
+          <w:cantSplit/>
+        </w:trPr>
+        <w:tc>
+          <w:tcPr>
+            <w:tcW w:type="dxa" w:w="4536"/>
+            <w:vAlign w:val="center"/>
+            <w:tcMar>
+              <w:top w:w="80" w:type="dxa"/>
+              <w:start w:w="80" w:type="dxa"/>
+              <w:bottom w:w="80" w:type="dxa"/>
+              <w:end w:w="80" w:type="dxa"/>
+            </w:tcMar>
+          </w:tcPr>
+          <w:p>
+            <w:pPr>
+              <w:jc w:val="center"/>
+            </w:pPr>
+            <w:r/>
+            <w:r>
+              <w:rPr>
+                <w:rFonts w:ascii="Times New Roman" w:hAnsi="Times New Roman" w:cs="Times New Roman" w:eastAsia="宋体"/>
+                <w:sz w:val="21"/>
+              </w:rPr>
+              <w:t>nominal_inclusion_probability</w:t>
+            </w:r>
+          </w:p>
+        </w:tc>
+        <w:tc>
+          <w:tcPr>
+            <w:tcW w:type="dxa" w:w="4536"/>
+            <w:vAlign w:val="center"/>
+            <w:tcMar>
+              <w:top w:w="80" w:type="dxa"/>
+              <w:start w:w="80" w:type="dxa"/>
+              <w:bottom w:w="80" w:type="dxa"/>
+              <w:end w:w="80" w:type="dxa"/>
+            </w:tcMar>
+          </w:tcPr>
+          <w:p>
+            <w:pPr>
+              <w:jc w:val="center"/>
+            </w:pPr>
+            <w:r/>
+            <w:r>
+              <w:rPr>
+                <w:rFonts w:ascii="Times New Roman" w:hAnsi="Times New Roman" w:cs="Times New Roman" w:eastAsia="宋体"/>
+                <w:sz w:val="21"/>
+              </w:rPr>
+              <w:t>基础层的名义概率；目标补样为空</w:t>
+            </w:r>
+          </w:p>
+        </w:tc>
+      </w:tr>
+      <w:tr>
+        <w:trPr>
+          <w:cantSplit/>
+        </w:trPr>
+        <w:tc>
+          <w:tcPr>
+            <w:tcW w:type="dxa" w:w="4536"/>
+            <w:vAlign w:val="center"/>
+            <w:tcMar>
+              <w:top w:w="80" w:type="dxa"/>
+              <w:start w:w="80" w:type="dxa"/>
+              <w:bottom w:w="80" w:type="dxa"/>
+              <w:end w:w="80" w:type="dxa"/>
+            </w:tcMar>
+          </w:tcPr>
+          <w:p>
+            <w:pPr>
+              <w:jc w:val="center"/>
+            </w:pPr>
+            <w:r/>
+            <w:r>
+              <w:rPr>
+                <w:rFonts w:ascii="Times New Roman" w:hAnsi="Times New Roman" w:cs="Times New Roman" w:eastAsia="宋体"/>
+                <w:sz w:val="21"/>
+              </w:rPr>
+              <w:t>design_weight_nullable</w:t>
+            </w:r>
+          </w:p>
+        </w:tc>
+        <w:tc>
+          <w:tcPr>
+            <w:tcW w:type="dxa" w:w="4536"/>
+            <w:vAlign w:val="center"/>
+            <w:tcMar>
+              <w:top w:w="80" w:type="dxa"/>
+              <w:start w:w="80" w:type="dxa"/>
+              <w:bottom w:w="80" w:type="dxa"/>
+              <w:end w:w="80" w:type="dxa"/>
+            </w:tcMar>
+          </w:tcPr>
+          <w:p>
+            <w:pPr>
+              <w:jc w:val="center"/>
+            </w:pPr>
+            <w:r/>
+            <w:r>
+              <w:rPr>
+                <w:rFonts w:ascii="Times New Roman" w:hAnsi="Times New Roman" w:cs="Times New Roman" w:eastAsia="宋体"/>
+                <w:sz w:val="21"/>
+              </w:rPr>
+              <w:t>仅概率设计实现并审计后填写，否则为空</w:t>
+            </w:r>
+          </w:p>
+        </w:tc>
+      </w:tr>
+      <w:tr>
+        <w:trPr>
+          <w:cantSplit/>
+        </w:trPr>
+        <w:tc>
+          <w:tcPr>
+            <w:tcW w:type="dxa" w:w="4536"/>
             <w:vAlign w:val="center"/>
             <w:tcMar>
               <w:top w:w="80" w:type="dxa"/>
@@ -4020,7 +5778,7 @@
         </w:tc>
         <w:tc>
           <w:tcPr>
-            <w:tcW w:type="dxa" w:w="4703"/>
+            <w:tcW w:type="dxa" w:w="4536"/>
             <w:vAlign w:val="center"/>
             <w:tcMar>
               <w:top w:w="80" w:type="dxa"/>
@@ -4045,9 +5803,12 @@
         </w:tc>
       </w:tr>
       <w:tr>
+        <w:trPr>
+          <w:cantSplit/>
+        </w:trPr>
         <w:tc>
           <w:tcPr>
-            <w:tcW w:type="dxa" w:w="4703"/>
+            <w:tcW w:type="dxa" w:w="4536"/>
             <w:vAlign w:val="center"/>
             <w:tcMar>
               <w:top w:w="80" w:type="dxa"/>
@@ -4072,7 +5833,7 @@
         </w:tc>
         <w:tc>
           <w:tcPr>
-            <w:tcW w:type="dxa" w:w="4703"/>
+            <w:tcW w:type="dxa" w:w="4536"/>
             <w:vAlign w:val="center"/>
             <w:tcMar>
               <w:top w:w="80" w:type="dxa"/>
@@ -4097,9 +5858,12 @@
         </w:tc>
       </w:tr>
       <w:tr>
+        <w:trPr>
+          <w:cantSplit/>
+        </w:trPr>
         <w:tc>
           <w:tcPr>
-            <w:tcW w:type="dxa" w:w="4703"/>
+            <w:tcW w:type="dxa" w:w="4536"/>
             <w:vAlign w:val="center"/>
             <w:tcMar>
               <w:top w:w="80" w:type="dxa"/>
@@ -4124,7 +5888,7 @@
         </w:tc>
         <w:tc>
           <w:tcPr>
-            <w:tcW w:type="dxa" w:w="4703"/>
+            <w:tcW w:type="dxa" w:w="4536"/>
             <w:vAlign w:val="center"/>
             <w:tcMar>
               <w:top w:w="80" w:type="dxa"/>
@@ -4149,9 +5913,12 @@
         </w:tc>
       </w:tr>
       <w:tr>
+        <w:trPr>
+          <w:cantSplit/>
+        </w:trPr>
         <w:tc>
           <w:tcPr>
-            <w:tcW w:type="dxa" w:w="4703"/>
+            <w:tcW w:type="dxa" w:w="4536"/>
             <w:vAlign w:val="center"/>
             <w:tcMar>
               <w:top w:w="80" w:type="dxa"/>
@@ -4176,7 +5943,7 @@
         </w:tc>
         <w:tc>
           <w:tcPr>
-            <w:tcW w:type="dxa" w:w="4703"/>
+            <w:tcW w:type="dxa" w:w="4536"/>
             <w:vAlign w:val="center"/>
             <w:tcMar>
               <w:top w:w="80" w:type="dxa"/>
@@ -4201,9 +5968,12 @@
         </w:tc>
       </w:tr>
       <w:tr>
+        <w:trPr>
+          <w:cantSplit/>
+        </w:trPr>
         <w:tc>
           <w:tcPr>
-            <w:tcW w:type="dxa" w:w="4703"/>
+            <w:tcW w:type="dxa" w:w="4536"/>
             <w:vAlign w:val="center"/>
             <w:tcMar>
               <w:top w:w="80" w:type="dxa"/>
@@ -4228,7 +5998,7 @@
         </w:tc>
         <w:tc>
           <w:tcPr>
-            <w:tcW w:type="dxa" w:w="4703"/>
+            <w:tcW w:type="dxa" w:w="4536"/>
             <w:vAlign w:val="center"/>
             <w:tcMar>
               <w:top w:w="80" w:type="dxa"/>
@@ -4253,9 +6023,12 @@
         </w:tc>
       </w:tr>
       <w:tr>
+        <w:trPr>
+          <w:cantSplit/>
+        </w:trPr>
         <w:tc>
           <w:tcPr>
-            <w:tcW w:type="dxa" w:w="4703"/>
+            <w:tcW w:type="dxa" w:w="4536"/>
             <w:vAlign w:val="center"/>
             <w:tcMar>
               <w:top w:w="80" w:type="dxa"/>
@@ -4280,7 +6053,7 @@
         </w:tc>
         <w:tc>
           <w:tcPr>
-            <w:tcW w:type="dxa" w:w="4703"/>
+            <w:tcW w:type="dxa" w:w="4536"/>
             <w:vAlign w:val="center"/>
             <w:tcMar>
               <w:top w:w="80" w:type="dxa"/>
@@ -4361,7 +6134,16 @@
           <w:rFonts w:ascii="Times New Roman" w:hAnsi="Times New Roman" w:cs="Times New Roman" w:eastAsia="宋体"/>
           <w:sz w:val="24"/>
         </w:rPr>
-        <w:t>3. 执行边界修正后的 1% 基础抽样，核对 57,405 个基础位置。</w:t>
+        <w:t>3. 修复 UTM 唯一归属并逐 patch 枚举准确边界候选数，按种子 20260717 重新</w:t>
+      </w:r>
+    </w:p>
+    <w:p>
+      <w:r>
+        <w:rPr>
+          <w:rFonts w:ascii="Times New Roman" w:hAnsi="Times New Roman" w:cs="Times New Roman" w:eastAsia="宋体"/>
+          <w:sz w:val="24"/>
+        </w:rPr>
+        <w:t>执行基础抽样；跨区去重后从基础有序候补池补足到规划数量 57,405。</w:t>
       </w:r>
     </w:p>
     <w:p>
@@ -4373,7 +6155,7 @@
           <w:rFonts w:ascii="Times New Roman" w:hAnsi="Times New Roman" w:cs="Times New Roman" w:eastAsia="宋体"/>
           <w:sz w:val="24"/>
         </w:rPr>
-        <w:t>4. 按 UTM 分区面积平方根增加 2,595 个空间均衡样本。</w:t>
+        <w:t>4. 按 UTM 分区准确有效候选数平方根增加空间均衡样本，使前两层合计 60,000。</w:t>
       </w:r>
     </w:p>
     <w:p>
@@ -4433,7 +6215,7 @@
           <w:rFonts w:ascii="Times New Roman" w:hAnsi="Times New Roman" w:cs="Times New Roman" w:eastAsia="宋体"/>
           <w:sz w:val="24"/>
         </w:rPr>
-        <w:t>9. 对核心源、掩膜和配准执行质量门槛，生成补片清单。</w:t>
+        <w:t>9. 对优先核心源、掩膜和配准执行质量门槛，生成影像数据修复清单。</w:t>
       </w:r>
     </w:p>
     <w:p>
@@ -4445,7 +6227,19 @@
           <w:rFonts w:ascii="Times New Roman" w:hAnsi="Times New Roman" w:cs="Times New Roman" w:eastAsia="宋体"/>
           <w:sz w:val="24"/>
         </w:rPr>
-        <w:t>10. 冻结 registry、checksum 和 Git commit 后，才开始正式数据裁窗和训练。</w:t>
+        <w:t>10. 开发专用的季度策略适配器、四池语义选择器、质量汇总和注册表验证器。</w:t>
+      </w:r>
+    </w:p>
+    <w:p>
+      <w:pPr>
+        <w:ind w:left="340"/>
+      </w:pPr>
+      <w:r>
+        <w:rPr>
+          <w:rFonts w:ascii="Times New Roman" w:hAnsi="Times New Roman" w:cs="Times New Roman" w:eastAsia="宋体"/>
+          <w:sz w:val="24"/>
+        </w:rPr>
+        <w:t>11. 冻结注册表、checksum 和 Git commit 后，才开始正式数据裁窗和训练。</w:t>
       </w:r>
     </w:p>
     <w:p>
@@ -4471,13 +6265,17 @@
         <w:tblLook w:firstColumn="1" w:firstRow="1" w:lastColumn="0" w:lastRow="0" w:noHBand="0" w:noVBand="1" w:val="04A0"/>
       </w:tblPr>
       <w:tblGrid>
-        <w:gridCol w:w="4703"/>
-        <w:gridCol w:w="4703"/>
+        <w:gridCol w:w="4536"/>
+        <w:gridCol w:w="4536"/>
       </w:tblGrid>
       <w:tr>
+        <w:trPr>
+          <w:cantSplit/>
+          <w:tblHeader w:val="true"/>
+        </w:trPr>
         <w:tc>
           <w:tcPr>
-            <w:tcW w:type="dxa" w:w="4703"/>
+            <w:tcW w:type="dxa" w:w="4536"/>
             <w:vAlign w:val="center"/>
             <w:tcMar>
               <w:top w:w="80" w:type="dxa"/>
@@ -4508,7 +6306,7 @@
         </w:tc>
         <w:tc>
           <w:tcPr>
-            <w:tcW w:type="dxa" w:w="4703"/>
+            <w:tcW w:type="dxa" w:w="4536"/>
             <w:vAlign w:val="center"/>
             <w:tcMar>
               <w:top w:w="80" w:type="dxa"/>
@@ -4539,9 +6337,12 @@
         </w:tc>
       </w:tr>
       <w:tr>
+        <w:trPr>
+          <w:cantSplit/>
+        </w:trPr>
         <w:tc>
           <w:tcPr>
-            <w:tcW w:type="dxa" w:w="4703"/>
+            <w:tcW w:type="dxa" w:w="4536"/>
             <w:vAlign w:val="center"/>
             <w:tcMar>
               <w:top w:w="80" w:type="dxa"/>
@@ -4566,7 +6367,7 @@
         </w:tc>
         <w:tc>
           <w:tcPr>
-            <w:tcW w:type="dxa" w:w="4703"/>
+            <w:tcW w:type="dxa" w:w="4536"/>
             <w:vAlign w:val="center"/>
             <w:tcMar>
               <w:top w:w="80" w:type="dxa"/>
@@ -4585,15 +6386,18 @@
                 <w:rFonts w:ascii="Times New Roman" w:hAnsi="Times New Roman" w:cs="Times New Roman" w:eastAsia="宋体"/>
                 <w:sz w:val="21"/>
               </w:rPr>
-              <w:t>四层合计严格等于 62,000</w:t>
+              <w:t>质量验收与候补替换后四层合计严格等于 62,000</w:t>
             </w:r>
           </w:p>
         </w:tc>
       </w:tr>
       <w:tr>
+        <w:trPr>
+          <w:cantSplit/>
+        </w:trPr>
         <w:tc>
           <w:tcPr>
-            <w:tcW w:type="dxa" w:w="4703"/>
+            <w:tcW w:type="dxa" w:w="4536"/>
             <w:vAlign w:val="center"/>
             <w:tcMar>
               <w:top w:w="80" w:type="dxa"/>
@@ -4618,7 +6422,7 @@
         </w:tc>
         <w:tc>
           <w:tcPr>
-            <w:tcW w:type="dxa" w:w="4703"/>
+            <w:tcW w:type="dxa" w:w="4536"/>
             <w:vAlign w:val="center"/>
             <w:tcMar>
               <w:top w:w="80" w:type="dxa"/>
@@ -4637,15 +6441,73 @@
                 <w:rFonts w:ascii="Times New Roman" w:hAnsi="Times New Roman" w:cs="Times New Roman" w:eastAsia="宋体"/>
                 <w:sz w:val="21"/>
               </w:rPr>
-              <w:t>patch_id 和 geometry_hash 均无重复</w:t>
+              <w:t>patch_id、identity hash 和规范化 footprint hash 均无重复</w:t>
             </w:r>
           </w:p>
         </w:tc>
       </w:tr>
       <w:tr>
+        <w:trPr>
+          <w:cantSplit/>
+        </w:trPr>
         <w:tc>
           <w:tcPr>
-            <w:tcW w:type="dxa" w:w="4703"/>
+            <w:tcW w:type="dxa" w:w="4536"/>
+            <w:vAlign w:val="center"/>
+            <w:tcMar>
+              <w:top w:w="80" w:type="dxa"/>
+              <w:start w:w="80" w:type="dxa"/>
+              <w:bottom w:w="80" w:type="dxa"/>
+              <w:end w:w="80" w:type="dxa"/>
+            </w:tcMar>
+          </w:tcPr>
+          <w:p>
+            <w:pPr>
+              <w:jc w:val="center"/>
+            </w:pPr>
+            <w:r/>
+            <w:r>
+              <w:rPr>
+                <w:rFonts w:ascii="Times New Roman" w:hAnsi="Times New Roman" w:cs="Times New Roman" w:eastAsia="宋体"/>
+                <w:sz w:val="21"/>
+              </w:rPr>
+              <w:t>空间重叠</w:t>
+            </w:r>
+          </w:p>
+        </w:tc>
+        <w:tc>
+          <w:tcPr>
+            <w:tcW w:type="dxa" w:w="4536"/>
+            <w:vAlign w:val="center"/>
+            <w:tcMar>
+              <w:top w:w="80" w:type="dxa"/>
+              <w:start w:w="80" w:type="dxa"/>
+              <w:bottom w:w="80" w:type="dxa"/>
+              <w:end w:w="80" w:type="dxa"/>
+            </w:tcMar>
+          </w:tcPr>
+          <w:p>
+            <w:pPr>
+              <w:jc w:val="center"/>
+            </w:pPr>
+            <w:r/>
+            <w:r>
+              <w:rPr>
+                <w:rFonts w:ascii="Times New Roman" w:hAnsi="Times New Roman" w:cs="Times New Roman" w:eastAsia="宋体"/>
+                <w:sz w:val="21"/>
+              </w:rPr>
+              <w:t>跨 UTM 相交面积不超过任一 patch 面积的 1%</w:t>
+            </w:r>
+          </w:p>
+        </w:tc>
+      </w:tr>
+      <w:tr>
+        <w:trPr>
+          <w:cantSplit/>
+        </w:trPr>
+        <w:tc>
+          <w:tcPr>
+            <w:tcW w:type="dxa" w:w="4536"/>
             <w:vAlign w:val="center"/>
             <w:tcMar>
               <w:top w:w="80" w:type="dxa"/>
@@ -4670,7 +6532,7 @@
         </w:tc>
         <w:tc>
           <w:tcPr>
-            <w:tcW w:type="dxa" w:w="4703"/>
+            <w:tcW w:type="dxa" w:w="4536"/>
             <w:vAlign w:val="center"/>
             <w:tcMar>
               <w:top w:w="80" w:type="dxa"/>
@@ -4695,9 +6557,12 @@
         </w:tc>
       </w:tr>
       <w:tr>
+        <w:trPr>
+          <w:cantSplit/>
+        </w:trPr>
         <w:tc>
           <w:tcPr>
-            <w:tcW w:type="dxa" w:w="4703"/>
+            <w:tcW w:type="dxa" w:w="4536"/>
             <w:vAlign w:val="center"/>
             <w:tcMar>
               <w:top w:w="80" w:type="dxa"/>
@@ -4722,7 +6587,7 @@
         </w:tc>
         <w:tc>
           <w:tcPr>
-            <w:tcW w:type="dxa" w:w="4703"/>
+            <w:tcW w:type="dxa" w:w="4536"/>
             <w:vAlign w:val="center"/>
             <w:tcMar>
               <w:top w:w="80" w:type="dxa"/>
@@ -4747,9 +6612,12 @@
         </w:tc>
       </w:tr>
       <w:tr>
+        <w:trPr>
+          <w:cantSplit/>
+        </w:trPr>
         <w:tc>
           <w:tcPr>
-            <w:tcW w:type="dxa" w:w="4703"/>
+            <w:tcW w:type="dxa" w:w="4536"/>
             <w:vAlign w:val="center"/>
             <w:tcMar>
               <w:top w:w="80" w:type="dxa"/>
@@ -4774,7 +6642,7 @@
         </w:tc>
         <w:tc>
           <w:tcPr>
-            <w:tcW w:type="dxa" w:w="4703"/>
+            <w:tcW w:type="dxa" w:w="4536"/>
             <w:vAlign w:val="center"/>
             <w:tcMar>
               <w:top w:w="80" w:type="dxa"/>
@@ -4799,9 +6667,12 @@
         </w:tc>
       </w:tr>
       <w:tr>
+        <w:trPr>
+          <w:cantSplit/>
+        </w:trPr>
         <w:tc>
           <w:tcPr>
-            <w:tcW w:type="dxa" w:w="4703"/>
+            <w:tcW w:type="dxa" w:w="4536"/>
             <w:vAlign w:val="center"/>
             <w:tcMar>
               <w:top w:w="80" w:type="dxa"/>
@@ -4826,7 +6697,7 @@
         </w:tc>
         <w:tc>
           <w:tcPr>
-            <w:tcW w:type="dxa" w:w="4703"/>
+            <w:tcW w:type="dxa" w:w="4536"/>
             <w:vAlign w:val="center"/>
             <w:tcMar>
               <w:top w:w="80" w:type="dxa"/>
@@ -4851,9 +6722,12 @@
         </w:tc>
       </w:tr>
       <w:tr>
+        <w:trPr>
+          <w:cantSplit/>
+        </w:trPr>
         <w:tc>
           <w:tcPr>
-            <w:tcW w:type="dxa" w:w="4703"/>
+            <w:tcW w:type="dxa" w:w="4536"/>
             <w:vAlign w:val="center"/>
             <w:tcMar>
               <w:top w:w="80" w:type="dxa"/>
@@ -4878,7 +6752,7 @@
         </w:tc>
         <w:tc>
           <w:tcPr>
-            <w:tcW w:type="dxa" w:w="4703"/>
+            <w:tcW w:type="dxa" w:w="4536"/>
             <w:vAlign w:val="center"/>
             <w:tcMar>
               <w:top w:w="80" w:type="dxa"/>
@@ -4897,15 +6771,18 @@
                 <w:rFonts w:ascii="Times New Roman" w:hAnsi="Times New Roman" w:cs="Times New Roman" w:eastAsia="宋体"/>
                 <w:sz w:val="21"/>
               </w:rPr>
-              <w:t>八季度逐源覆盖和质量统计齐全</w:t>
+              <w:t>八季度逐源覆盖、观测数、有效像素和日期统计齐全</w:t>
             </w:r>
           </w:p>
         </w:tc>
       </w:tr>
       <w:tr>
+        <w:trPr>
+          <w:cantSplit/>
+        </w:trPr>
         <w:tc>
           <w:tcPr>
-            <w:tcW w:type="dxa" w:w="4703"/>
+            <w:tcW w:type="dxa" w:w="4536"/>
             <w:vAlign w:val="center"/>
             <w:tcMar>
               <w:top w:w="80" w:type="dxa"/>
@@ -4930,7 +6807,7 @@
         </w:tc>
         <w:tc>
           <w:tcPr>
-            <w:tcW w:type="dxa" w:w="4703"/>
+            <w:tcW w:type="dxa" w:w="4536"/>
             <w:vAlign w:val="center"/>
             <w:tcMar>
               <w:top w:w="80" w:type="dxa"/>
@@ -4949,15 +6826,18 @@
                 <w:rFonts w:ascii="Times New Roman" w:hAnsi="Times New Roman" w:cs="Times New Roman" w:eastAsia="宋体"/>
                 <w:sz w:val="21"/>
               </w:rPr>
-              <w:t>云、云影、雪、无效值和饱和像素不计入重建</w:t>
+              <w:t>云、云影、无效值和饱和不计损失；雪作为地表状态保留</w:t>
             </w:r>
           </w:p>
         </w:tc>
       </w:tr>
       <w:tr>
+        <w:trPr>
+          <w:cantSplit/>
+        </w:trPr>
         <w:tc>
           <w:tcPr>
-            <w:tcW w:type="dxa" w:w="4703"/>
+            <w:tcW w:type="dxa" w:w="4536"/>
             <w:vAlign w:val="center"/>
             <w:tcMar>
               <w:top w:w="80" w:type="dxa"/>
@@ -4982,7 +6862,7 @@
         </w:tc>
         <w:tc>
           <w:tcPr>
-            <w:tcW w:type="dxa" w:w="4703"/>
+            <w:tcW w:type="dxa" w:w="4536"/>
             <w:vAlign w:val="center"/>
             <w:tcMar>
               <w:top w:w="80" w:type="dxa"/>
@@ -5007,9 +6887,67 @@
         </w:tc>
       </w:tr>
       <w:tr>
+        <w:trPr>
+          <w:cantSplit/>
+        </w:trPr>
         <w:tc>
           <w:tcPr>
-            <w:tcW w:type="dxa" w:w="4703"/>
+            <w:tcW w:type="dxa" w:w="4536"/>
+            <w:vAlign w:val="center"/>
+            <w:tcMar>
+              <w:top w:w="80" w:type="dxa"/>
+              <w:start w:w="80" w:type="dxa"/>
+              <w:bottom w:w="80" w:type="dxa"/>
+              <w:end w:w="80" w:type="dxa"/>
+            </w:tcMar>
+          </w:tcPr>
+          <w:p>
+            <w:pPr>
+              <w:jc w:val="center"/>
+            </w:pPr>
+            <w:r/>
+            <w:r>
+              <w:rPr>
+                <w:rFonts w:ascii="Times New Roman" w:hAnsi="Times New Roman" w:cs="Times New Roman" w:eastAsia="宋体"/>
+                <w:sz w:val="21"/>
+              </w:rPr>
+              <w:t>空间划分</w:t>
+            </w:r>
+          </w:p>
+        </w:tc>
+        <w:tc>
+          <w:tcPr>
+            <w:tcW w:type="dxa" w:w="4536"/>
+            <w:vAlign w:val="center"/>
+            <w:tcMar>
+              <w:top w:w="80" w:type="dxa"/>
+              <w:start w:w="80" w:type="dxa"/>
+              <w:bottom w:w="80" w:type="dxa"/>
+              <w:end w:w="80" w:type="dxa"/>
+            </w:tcMar>
+          </w:tcPr>
+          <w:p>
+            <w:pPr>
+              <w:jc w:val="center"/>
+            </w:pPr>
+            <w:r/>
+            <w:r>
+              <w:rPr>
+                <w:rFonts w:ascii="Times New Roman" w:hAnsi="Times New Roman" w:cs="Times New Roman" w:eastAsia="宋体"/>
+                <w:sz w:val="21"/>
+              </w:rPr>
+              <w:t>跨集合最近距离不小于 25.6 km</w:t>
+            </w:r>
+          </w:p>
+        </w:tc>
+      </w:tr>
+      <w:tr>
+        <w:trPr>
+          <w:cantSplit/>
+        </w:trPr>
+        <w:tc>
+          <w:tcPr>
+            <w:tcW w:type="dxa" w:w="4536"/>
             <w:vAlign w:val="center"/>
             <w:tcMar>
               <w:top w:w="80" w:type="dxa"/>
@@ -5034,7 +6972,7 @@
         </w:tc>
         <w:tc>
           <w:tcPr>
-            <w:tcW w:type="dxa" w:w="4703"/>
+            <w:tcW w:type="dxa" w:w="4536"/>
             <w:vAlign w:val="center"/>
             <w:tcMar>
               <w:top w:w="80" w:type="dxa"/>
@@ -5053,7 +6991,7 @@
                 <w:rFonts w:ascii="Times New Roman" w:hAnsi="Times New Roman" w:cs="Times New Roman" w:eastAsia="宋体"/>
                 <w:sz w:val="21"/>
               </w:rPr>
-              <w:t>分省、分层、分季度随机可视化无明显错误</w:t>
+              <w:t>每省每层至少抽 10 个、每季度至少抽 200 个并记录结论</w:t>
             </w:r>
           </w:p>
         </w:tc>
@@ -5079,7 +7017,16 @@
           <w:rFonts w:ascii="Times New Roman" w:hAnsi="Times New Roman" w:cs="Times New Roman" w:eastAsia="宋体"/>
           <w:sz w:val="24"/>
         </w:rPr>
-        <w:t>目前仓库中已有 57,405 个基础 1% 静态抽样点及全国分布预览，已有空间均衡和 海岸补样脚本。本文冻结的是最终 62,000 点的实施口径和配置，不代表 2,595、 500 和 1,500 个补样已经全部完成数据质量筛选。</w:t>
+        <w:t>数据盘中已有 57,405 个基础 1% 中心点静态候选及全国分布预览，也有历史 60,500 点临时清单。独立审查发现旧清单存在 UTM 接缝重叠、补样宏网格重复和 字段不完整，不能升级为正式注册表。现有空间均衡、海岸和语义注册脚本采用旧的 2025--2026 月度策略接口，不能直接读取本季度策略。</w:t>
+      </w:r>
+    </w:p>
+    <w:p>
+      <w:r>
+        <w:rPr>
+          <w:rFonts w:ascii="Times New Roman" w:hAnsi="Times New Roman" w:cs="Times New Roman" w:eastAsia="宋体"/>
+          <w:sz w:val="24"/>
+        </w:rPr>
+        <w:t>本文冻结的是 62,000 点的目标配额、质量门槛和验收口径。端到端物化适配器、 四池语义选择器、季度合成和空间划分仍须按第九节开发并通过测试。</w:t>
       </w:r>
     </w:p>
     <w:p>
@@ -5156,7 +7103,7 @@
           <w:rFonts w:ascii="Times New Roman" w:hAnsi="Times New Roman" w:cs="Times New Roman" w:eastAsia="宋体"/>
           <w:sz w:val="24"/>
         </w:rPr>
-        <w:t xml:space="preserve">采样策略配置： </w:t>
+        <w:t xml:space="preserve">采样策略规范（不是旧注册脚本的直接输入）： </w:t>
       </w:r>
       <w:r>
         <w:rPr>
@@ -5172,7 +7119,7 @@
           <w:rFonts w:ascii="Times New Roman" w:hAnsi="Times New Roman" w:cs="Times New Roman" w:eastAsia="宋体"/>
           <w:sz w:val="24"/>
         </w:rPr>
-        <w:t xml:space="preserve">基础抽样脚本： </w:t>
+        <w:t xml:space="preserve">基础抽样参考实现（须修复 UTM 唯一归属和准确边界枚举）： </w:t>
       </w:r>
       <w:r>
         <w:rPr>
@@ -5188,7 +7135,7 @@
           <w:rFonts w:ascii="Times New Roman" w:hAnsi="Times New Roman" w:cs="Times New Roman" w:eastAsia="宋体"/>
           <w:sz w:val="24"/>
         </w:rPr>
-        <w:t xml:space="preserve">空间均衡补样脚本： </w:t>
+        <w:t xml:space="preserve">空间均衡补样参考实现（须改为从所有未入选 patch 选择）： </w:t>
       </w:r>
       <w:r>
         <w:rPr>
@@ -5204,7 +7151,7 @@
           <w:rFonts w:ascii="Times New Roman" w:hAnsi="Times New Roman" w:cs="Times New Roman" w:eastAsia="宋体"/>
           <w:sz w:val="24"/>
         </w:rPr>
-        <w:t xml:space="preserve">海岸补样脚本： </w:t>
+        <w:t xml:space="preserve">海岸补样参考实现（须改为米制 footprint 陆海相交判定）： </w:t>
       </w:r>
       <w:r>
         <w:rPr>
@@ -5220,7 +7167,7 @@
           <w:rFonts w:ascii="Times New Roman" w:hAnsi="Times New Roman" w:cs="Times New Roman" w:eastAsia="宋体"/>
           <w:sz w:val="24"/>
         </w:rPr>
-        <w:t xml:space="preserve">语义与困难区域注册脚本： </w:t>
+        <w:t xml:space="preserve">旧语义注册脚本（接口不兼容，仅供重构参考）： </w:t>
       </w:r>
       <w:r>
         <w:rPr>
@@ -5246,20 +7193,10 @@
         <w:t>docs/plans/assets/china_v1_2021_multisource/national_static_1pct_sampling_preview.png</w:t>
       </w:r>
     </w:p>
-    <w:p>
-      <w:pPr>
-        <w:sectPr>
-          <w:footerReference w:type="default" r:id="rId9"/>
-          <w:pgSz w:w="12240" w:h="15840"/>
-          <w:pgMar w:top="1247" w:right="1417" w:bottom="1134" w:left="1417" w:header="720" w:footer="720" w:gutter="0"/>
-          <w:cols w:space="720"/>
-          <w:docGrid w:linePitch="360"/>
-        </w:sectPr>
-      </w:pPr>
-    </w:p>
     <w:sectPr>
-      <w:type w:val="continuous"/>
-      <w:pgSz w:w="12240" w:h="15840"/>
+      <w:footerReference w:type="default" r:id="rId9"/>
+      <w:headerReference w:type="default" r:id="rId10"/>
+      <w:pgSz w:w="11906" w:h="16838"/>
       <w:pgMar w:top="1247" w:right="1417" w:bottom="1134" w:left="1417" w:header="720" w:footer="720" w:gutter="0"/>
       <w:cols w:space="720"/>
       <w:docGrid w:linePitch="360"/>
@@ -5282,7 +7219,13 @@
       </w:rPr>
       <w:t xml:space="preserve">第 </w:t>
     </w:r>
-    <w:fldSimple w:instr="PAGE"/>
+    <w:r>
+      <w:fldChar w:fldCharType="begin"/>
+      <w:instrText xml:space="preserve"> PAGE </w:instrText>
+      <w:fldChar w:fldCharType="separate"/>
+      <w:t>1</w:t>
+      <w:fldChar w:fldCharType="end"/>
+    </w:r>
     <w:r>
       <w:rPr>
         <w:rFonts w:ascii="Times New Roman" w:hAnsi="Times New Roman" w:cs="Times New Roman" w:eastAsia="宋体"/>
@@ -5292,6 +7235,24 @@
     </w:r>
   </w:p>
 </w:ftr>
+</file>
+
+<file path=word/header1.xml><?xml version="1.0" encoding="utf-8"?>
+<w:hdr xmlns:m="http://schemas.openxmlformats.org/officeDocument/2006/math" xmlns:mc="http://schemas.openxmlformats.org/markup-compatibility/2006" xmlns:mo="http://schemas.microsoft.com/office/mac/office/2008/main" xmlns:mv="urn:schemas-microsoft-com:mac:vml" xmlns:o="urn:schemas-microsoft-com:office:office" xmlns:r="http://schemas.openxmlformats.org/officeDocument/2006/relationships" xmlns:v="urn:schemas-microsoft-com:vml" xmlns:w10="urn:schemas-microsoft-com:office:word" xmlns:w14="http://schemas.microsoft.com/office/word/2010/wordml" xmlns:w="http://schemas.openxmlformats.org/wordprocessingml/2006/main" xmlns:wne="http://schemas.microsoft.com/office/word/2006/wordml" xmlns:wp14="http://schemas.microsoft.com/office/word/2010/wordprocessingDrawing" xmlns:wp="http://schemas.openxmlformats.org/drawingml/2006/wordprocessingDrawing" xmlns:wpc="http://schemas.microsoft.com/office/word/2010/wordprocessingCanvas" xmlns:wpg="http://schemas.microsoft.com/office/word/2010/wordprocessingGroup" xmlns:wpi="http://schemas.microsoft.com/office/word/2010/wordprocessingInk" xmlns:wps="http://schemas.microsoft.com/office/word/2010/wordprocessingShape" mc:Ignorable="w14 wp14">
+  <w:p>
+    <w:pPr>
+      <w:pStyle w:val="Header"/>
+      <w:jc w:val="center"/>
+    </w:pPr>
+    <w:r>
+      <w:rPr>
+        <w:rFonts w:ascii="Times New Roman" w:hAnsi="Times New Roman" w:cs="Times New Roman" w:eastAsia="宋体"/>
+        <w:sz w:val="18"/>
+      </w:rPr>
+      <w:t>中国版 Alpha Earth 全国目标采样方案</w:t>
+    </w:r>
+  </w:p>
+</w:hdr>
 </file>
 
 <file path=word/numbering.xml><?xml version="1.0" encoding="utf-8"?>

</xml_diff>